<commit_message>
feat(abap): WEBP uploads, score in %, codelist texts, action menu and spreadsheet import
- accept WEBP photos (MIME, .webp extension, RIFF/WEBP signature)
- show the customer score as % with a red/yellow/green criticality bar
- show only the text of CodeList fields and an avatar for customers without a photo
- group the Pedido actions with #FOR_ACTION_GROUP (works in the ADT preview)
- add the spreadsheet import (ZCL_PC_PLANILHA, ZCL_PC_IMPORTACAO), setup classes and new packages
- ZPC_NR needs a buffer size greater than zero
- sync abap/ with the system and update the spec

Co-Authored-By: Claude Sonnet 5.5 <noreply@anthropic.com>
</commit_message>
<xml_diff>
--- a/docs/Pedidos_de_Compras_-_Especificacao_Tecnica_v2.docx
+++ b/docs/Pedidos_de_Compras_-_Especificacao_Tecnica_v2.docx
@@ -9778,7 +9778,7 @@
                 <w:szCs w:val="22"/>
                 <w:lang w:val="en-US" w:eastAsia="en-US" w:bidi="ar-SA"/>
               </w:rPr>
-              <w:t>Imagem do cliente. Aceitar apenas JPEG ou PNG.</w:t>
+              <w:t>Imagem do cliente. Aceitar apenas JPEG, PNG ou WEBP.</w:t>
             </w:r>
           </w:p>
         </w:tc>
@@ -11128,7 +11128,7 @@
                 <w:szCs w:val="22"/>
                 <w:lang w:val="en-US" w:eastAsia="en-US" w:bidi="ar-SA"/>
               </w:rPr>
-              <w:t>Score do cliente.</w:t>
+              <w:t>Score de 0 a 100, somente leitura (sorteado na criação). Exibido em % como barra de progresso com cor dinâmica: até 40 vermelho, de 40 a 70 amarelo e a partir de 70 verde (unidade % via virtual element ScoreUnidade).</w:t>
             </w:r>
           </w:p>
         </w:tc>
@@ -13521,7 +13521,7 @@
                 <w:szCs w:val="22"/>
                 <w:lang w:val="en-US" w:eastAsia="en-US" w:bidi="ar-SA"/>
               </w:rPr>
-              <w:t>Imagem JPEG/PNG do item.</w:t>
+              <w:t>Imagem JPEG/PNG/WEBP do item.</w:t>
             </w:r>
           </w:p>
         </w:tc>
@@ -23975,7 +23975,7 @@
       </w:pPr>
       <w:r>
         <w:rPr/>
-        <w:t>Fotos devem aceitar apenas JPEG ou PNG.</w:t>
+        <w:t>Fotos devem aceitar apenas JPEG, PNG ou WEBP.</w:t>
       </w:r>
     </w:p>
     <w:p>
@@ -24163,7 +24163,7 @@
       </w:pPr>
       <w:r>
         <w:rPr/>
-        <w:t>Fotos devem aceitar apenas JPEG ou PNG.</w:t>
+        <w:t>Fotos devem aceitar apenas JPEG, PNG ou WEBP.</w:t>
       </w:r>
     </w:p>
     <w:p>
@@ -31797,7 +31797,7 @@
                 <w:szCs w:val="22"/>
                 <w:lang w:val="en-US" w:eastAsia="en-US" w:bidi="ar-SA"/>
               </w:rPr>
-              <w:t>Formato de imagem inválido. Utilize JPEG ou PNG.</w:t>
+              <w:t>Formato de imagem inválido. Utilize JPEG, PNG ou WEBP.</w:t>
             </w:r>
           </w:p>
         </w:tc>
@@ -40408,6 +40408,276 @@
                 <w:lang w:val="en-US" w:eastAsia="en-US" w:bidi="ar-SA"/>
               </w:rPr>
               <w:t>ZCL_PC_SETUP (F9) é pré-requisito: sem os intervalos 01 e 02 o Save de pedido e de item falha com "Erro ao obter numeração".</w:t>
+            </w:r>
+          </w:p>
+        </w:tc>
+      </w:tr>
+      <w:tr>
+        <w:trPr/>
+        <w:tc>
+          <w:tcPr>
+            <w:tcW w:w="520" w:type="dxa"/>
+            <w:tcBorders/>
+            <w:vAlign w:val="center"/>
+          </w:tcPr>
+          <w:p>
+            <w:pPr>
+              <w:pStyle w:val="Normal"/>
+              <w:widowControl/>
+              <w:suppressAutoHyphens w:val="true"/>
+              <w:spacing w:lineRule="auto" w:line="240" w:before="0" w:after="0"/>
+              <w:jc w:val="left"/>
+              <w:rPr>
+                <w:rFonts w:cs=""/>
+                <w:kern w:val="0"/>
+                <w:szCs w:val="22"/>
+                <w:lang w:val="en-US" w:eastAsia="en-US" w:bidi="ar-SA"/>
+              </w:rPr>
+            </w:pPr>
+            <w:r>
+              <w:rPr>
+                <w:rFonts w:cs=""/>
+                <w:b/>
+                <w:kern w:val="0"/>
+                <w:sz w:val="17"/>
+                <w:szCs w:val="22"/>
+                <w:lang w:val="en-US" w:eastAsia="en-US" w:bidi="ar-SA"/>
+              </w:rPr>
+              <w:t>13</w:t>
+            </w:r>
+          </w:p>
+        </w:tc>
+        <w:tc>
+          <w:tcPr>
+            <w:tcW w:w="1400" w:type="dxa"/>
+            <w:tcBorders/>
+            <w:vAlign w:val="center"/>
+          </w:tcPr>
+          <w:p>
+            <w:pPr>
+              <w:pStyle w:val="Normal"/>
+              <w:widowControl/>
+              <w:suppressAutoHyphens w:val="true"/>
+              <w:spacing w:lineRule="auto" w:line="240" w:before="0" w:after="0"/>
+              <w:jc w:val="left"/>
+              <w:rPr>
+                <w:rFonts w:cs=""/>
+                <w:kern w:val="0"/>
+                <w:szCs w:val="22"/>
+                <w:lang w:val="en-US" w:eastAsia="en-US" w:bidi="ar-SA"/>
+              </w:rPr>
+            </w:pPr>
+            <w:r>
+              <w:rPr>
+                <w:rFonts w:cs=""/>
+                <w:b/>
+                <w:kern w:val="0"/>
+                <w:sz w:val="17"/>
+                <w:szCs w:val="22"/>
+                <w:lang w:val="en-US" w:eastAsia="en-US" w:bidi="ar-SA"/>
+              </w:rPr>
+              <w:t>7.2, 7.4, 17</w:t>
+            </w:r>
+          </w:p>
+        </w:tc>
+        <w:tc>
+          <w:tcPr>
+            <w:tcW w:w="4000" w:type="dxa"/>
+            <w:tcBorders/>
+            <w:vAlign w:val="center"/>
+          </w:tcPr>
+          <w:p>
+            <w:pPr>
+              <w:pStyle w:val="Normal"/>
+              <w:widowControl/>
+              <w:suppressAutoHyphens w:val="true"/>
+              <w:spacing w:lineRule="auto" w:line="240" w:before="0" w:after="0"/>
+              <w:jc w:val="left"/>
+              <w:rPr>
+                <w:rFonts w:cs=""/>
+                <w:kern w:val="0"/>
+                <w:szCs w:val="22"/>
+                <w:lang w:val="en-US" w:eastAsia="en-US" w:bidi="ar-SA"/>
+              </w:rPr>
+            </w:pPr>
+            <w:r>
+              <w:rPr>
+                <w:rFonts w:cs=""/>
+                <w:b/>
+                <w:kern w:val="0"/>
+                <w:sz w:val="17"/>
+                <w:szCs w:val="22"/>
+                <w:lang w:val="en-US" w:eastAsia="en-US" w:bidi="ar-SA"/>
+              </w:rPr>
+              <w:t>Imagens de cliente e item: apenas JPEG ou PNG.</w:t>
+            </w:r>
+          </w:p>
+        </w:tc>
+        <w:tc>
+          <w:tcPr>
+            <w:tcW w:w="4006" w:type="dxa"/>
+            <w:tcBorders/>
+            <w:vAlign w:val="center"/>
+          </w:tcPr>
+          <w:p>
+            <w:pPr>
+              <w:pStyle w:val="Normal"/>
+              <w:widowControl/>
+              <w:suppressAutoHyphens w:val="true"/>
+              <w:spacing w:lineRule="auto" w:line="240" w:before="0" w:after="0"/>
+              <w:jc w:val="left"/>
+              <w:rPr>
+                <w:rFonts w:cs=""/>
+                <w:kern w:val="0"/>
+                <w:szCs w:val="22"/>
+                <w:lang w:val="en-US" w:eastAsia="en-US" w:bidi="ar-SA"/>
+              </w:rPr>
+            </w:pPr>
+            <w:r>
+              <w:rPr>
+                <w:rFonts w:cs=""/>
+                <w:b/>
+                <w:kern w:val="0"/>
+                <w:sz w:val="17"/>
+                <w:szCs w:val="22"/>
+                <w:lang w:val="en-US" w:eastAsia="en-US" w:bidi="ar-SA"/>
+              </w:rPr>
+              <w:t>WEBP passa a ser aceito (image/webp): validar_imagem confere MIME, extensão .webp e assinatura RIFF....WEBP; acceptableMimeTypes das views e mensagem 009 atualizados.</w:t>
+            </w:r>
+          </w:p>
+        </w:tc>
+      </w:tr>
+      <w:tr>
+        <w:trPr/>
+        <w:tc>
+          <w:tcPr>
+            <w:tcW w:w="520" w:type="dxa"/>
+            <w:tcBorders/>
+            <w:vAlign w:val="center"/>
+          </w:tcPr>
+          <w:p>
+            <w:pPr>
+              <w:pStyle w:val="Normal"/>
+              <w:widowControl/>
+              <w:suppressAutoHyphens w:val="true"/>
+              <w:spacing w:lineRule="auto" w:line="240" w:before="0" w:after="0"/>
+              <w:jc w:val="left"/>
+              <w:rPr>
+                <w:rFonts w:cs=""/>
+                <w:kern w:val="0"/>
+                <w:szCs w:val="22"/>
+                <w:lang w:val="en-US" w:eastAsia="en-US" w:bidi="ar-SA"/>
+              </w:rPr>
+            </w:pPr>
+            <w:r>
+              <w:rPr>
+                <w:rFonts w:cs=""/>
+                <w:b/>
+                <w:kern w:val="0"/>
+                <w:sz w:val="17"/>
+                <w:szCs w:val="22"/>
+                <w:lang w:val="en-US" w:eastAsia="en-US" w:bidi="ar-SA"/>
+              </w:rPr>
+              <w:t>14</w:t>
+            </w:r>
+          </w:p>
+        </w:tc>
+        <w:tc>
+          <w:tcPr>
+            <w:tcW w:w="1400" w:type="dxa"/>
+            <w:tcBorders/>
+            <w:vAlign w:val="center"/>
+          </w:tcPr>
+          <w:p>
+            <w:pPr>
+              <w:pStyle w:val="Normal"/>
+              <w:widowControl/>
+              <w:suppressAutoHyphens w:val="true"/>
+              <w:spacing w:lineRule="auto" w:line="240" w:before="0" w:after="0"/>
+              <w:jc w:val="left"/>
+              <w:rPr>
+                <w:rFonts w:cs=""/>
+                <w:kern w:val="0"/>
+                <w:szCs w:val="22"/>
+                <w:lang w:val="en-US" w:eastAsia="en-US" w:bidi="ar-SA"/>
+              </w:rPr>
+            </w:pPr>
+            <w:r>
+              <w:rPr>
+                <w:rFonts w:cs=""/>
+                <w:b/>
+                <w:kern w:val="0"/>
+                <w:sz w:val="17"/>
+                <w:szCs w:val="22"/>
+                <w:lang w:val="en-US" w:eastAsia="en-US" w:bidi="ar-SA"/>
+              </w:rPr>
+              <w:t>7.2</w:t>
+            </w:r>
+          </w:p>
+        </w:tc>
+        <w:tc>
+          <w:tcPr>
+            <w:tcW w:w="4000" w:type="dxa"/>
+            <w:tcBorders/>
+            <w:vAlign w:val="center"/>
+          </w:tcPr>
+          <w:p>
+            <w:pPr>
+              <w:pStyle w:val="Normal"/>
+              <w:widowControl/>
+              <w:suppressAutoHyphens w:val="true"/>
+              <w:spacing w:lineRule="auto" w:line="240" w:before="0" w:after="0"/>
+              <w:jc w:val="left"/>
+              <w:rPr>
+                <w:rFonts w:cs=""/>
+                <w:kern w:val="0"/>
+                <w:szCs w:val="22"/>
+                <w:lang w:val="en-US" w:eastAsia="en-US" w:bidi="ar-SA"/>
+              </w:rPr>
+            </w:pPr>
+            <w:r>
+              <w:rPr>
+                <w:rFonts w:cs=""/>
+                <w:b/>
+                <w:kern w:val="0"/>
+                <w:sz w:val="17"/>
+                <w:szCs w:val="22"/>
+                <w:lang w:val="en-US" w:eastAsia="en-US" w:bidi="ar-SA"/>
+              </w:rPr>
+              <w:t>Score do cliente exibido como número na barra de progresso, sem cor dinâmica.</w:t>
+            </w:r>
+          </w:p>
+        </w:tc>
+        <w:tc>
+          <w:tcPr>
+            <w:tcW w:w="4006" w:type="dxa"/>
+            <w:tcBorders/>
+            <w:vAlign w:val="center"/>
+          </w:tcPr>
+          <w:p>
+            <w:pPr>
+              <w:pStyle w:val="Normal"/>
+              <w:widowControl/>
+              <w:suppressAutoHyphens w:val="true"/>
+              <w:spacing w:lineRule="auto" w:line="240" w:before="0" w:after="0"/>
+              <w:jc w:val="left"/>
+              <w:rPr>
+                <w:rFonts w:cs=""/>
+                <w:kern w:val="0"/>
+                <w:szCs w:val="22"/>
+                <w:lang w:val="en-US" w:eastAsia="en-US" w:bidi="ar-SA"/>
+              </w:rPr>
+            </w:pPr>
+            <w:r>
+              <w:rPr>
+                <w:rFonts w:cs=""/>
+                <w:b/>
+                <w:kern w:val="0"/>
+                <w:sz w:val="17"/>
+                <w:szCs w:val="22"/>
+                <w:lang w:val="en-US" w:eastAsia="en-US" w:bidi="ar-SA"/>
+              </w:rPr>
+              <w:t>Score exibido em % (unidade % por virtual element) e barra com criticidade calculada: vermelho até 40, amarelo de 40 a 70, verde a partir de 70.</w:t>
             </w:r>
           </w:p>
         </w:tc>

</xml_diff>

<commit_message>
docs: README e especificação técnica v2.2
Novo modelo de status (ABERTO, AGUARDANDO_APROVACAO, PROCESSANDO_REEMBOLSO, CANCELADO,
FINALIZADO) e pagamento DEVOLVIDO, edição dos itens do pedido aberto, Object Page dinâmica,
ações Efetuar Pagamento e Aprovar pedido, CEP somente leitura em endereço gravado, camada
analítica e suíte permanente de testes.

Co-Authored-By: Claude Sonnet 5.5 <noreply@anthropic.com>
</commit_message>
<xml_diff>
--- a/docs/Pedidos_de_Compras_-_Especificacao_Tecnica_v2.docx
+++ b/docs/Pedidos_de_Compras_-_Especificacao_Tecnica_v2.docx
@@ -63,7 +63,7 @@
       </w:pPr>
       <w:r>
         <w:rPr/>
-        <w:t>Esta é a versão 2.1 da especificação: a revisão técnica 2.0 para ABAP Cloud (strict mode 2), alinhada ao código-fonte, acrescida das alterações da seção 23 (Reembolso como aplicação própria, registro do pedido com reserva automática de estoque, SKU gerado no Save e ajustes de nomenclatura).</w:t>
+        <w:t>Esta é a versão 2.2 da especificação: a revisão técnica 2.0 para ABAP Cloud (strict mode 2), alinhada ao código-fonte, acrescida das alterações das seções 23 a 25 (v2.1: Reembolso como aplicação própria, registro do pedido com reserva automática de estoque, SKU gerado no Save; v2.2: novo modelo de status do pedido, edição dos itens do pedido aberto com reserva incremental, Object Page dinâmica, camada analítica e suíte permanente de testes).</w:t>
       </w:r>
     </w:p>
     <w:p>
@@ -195,6 +195,34 @@
       </w:pPr>
       <w:r>
         <w:rPr/>
+        <w:t>Edição dos itens do pedido ABERTO (Editar + Salvar): incluir, remover ou alterar a quantidade de um item ajusta a reserva de estoque pela diferença; o cliente do pedido não pode ser trocado.</w:t>
+      </w:r>
+    </w:p>
+    <w:p>
+      <w:pPr>
+        <w:pStyle w:val="ListBullet"/>
+        <w:numPr>
+          <w:ilvl w:val="0"/>
+          <w:numId w:val="1"/>
+        </w:numPr>
+        <w:rPr/>
+      </w:pPr>
+      <w:r>
+        <w:rPr/>
+        <w:t>Object Page do pedido dinâmica: seções Dados do Cliente, Dados do Pedido, Itens, Pagamento e Finalização/Cancelamento, exibidas conforme o status; cliente e itens vêm dos snapshots quando o pedido está FINALIZADO ou CANCELADO.</w:t>
+      </w:r>
+    </w:p>
+    <w:p>
+      <w:pPr>
+        <w:pStyle w:val="ListBullet"/>
+        <w:numPr>
+          <w:ilvl w:val="0"/>
+          <w:numId w:val="1"/>
+        </w:numPr>
+        <w:rPr/>
+      </w:pPr>
+      <w:r>
+        <w:rPr/>
         <w:t>Registro do pedido ao salvar o rascunho (Save), com validação, cálculo de total, fixação de preço e reserva automática de estoque dos itens — não há action de confirmação.</w:t>
       </w:r>
     </w:p>
@@ -209,7 +237,7 @@
       </w:pPr>
       <w:r>
         <w:rPr/>
-        <w:t>Pagamento simulado com cartão de crédito ou débito, sem persistência de dados sensíveis.</w:t>
+        <w:t>Pagamento simulado com cartão de crédito ou débito (action Efetuar Pagamento), sem persistência de dados sensíveis.</w:t>
       </w:r>
     </w:p>
     <w:p>
@@ -237,7 +265,7 @@
       </w:pPr>
       <w:r>
         <w:rPr/>
-        <w:t>Aprovação/finalização do pedido com baixa de estoque, geração de snapshots e imutabilidade do histórico.</w:t>
+        <w:t>Aprovação do pedido (action Aprovar pedido) com baixa de estoque, geração de snapshots, finalização e imutabilidade do histórico.</w:t>
       </w:r>
     </w:p>
     <w:p>
@@ -251,7 +279,7 @@
       </w:pPr>
       <w:r>
         <w:rPr/>
-        <w:t>Cancelamento de pedido com motivo obrigatório, liberação de reserva e geração de snapshots; quando o pagamento já foi aprovado, o cancelamento abre uma solicitação de reembolso (status PROCESSAR_REEMBOLSO) que é decidida na aplicação Gestão de Reembolsos.</w:t>
+        <w:t>Cancelamento de pedido com motivo obrigatório, liberação de reserva e geração de snapshots; quando o pagamento já foi aprovado, o cancelamento abre uma solicitação de reembolso (status PROCESSANDO_REEMBOLSO) que é decidida na aplicação Gestão de Reembolsos.</w:t>
       </w:r>
     </w:p>
     <w:p>
@@ -312,6 +340,20 @@
     </w:p>
     <w:p>
       <w:pPr>
+        <w:pStyle w:val="ListBullet"/>
+        <w:numPr>
+          <w:ilvl w:val="0"/>
+          <w:numId w:val="1"/>
+        </w:numPr>
+        <w:rPr/>
+      </w:pPr>
+      <w:r>
+        <w:rPr/>
+        <w:t>Camada analítica somente leitura: cubos ZI_PC_*_CUBE, consultas ZC_PC_*_ANALISE, serviço ZUI_PC_ANALITICO, 20 aplicações ALP (um gráfico por cenário) e o Painel de Compras (Overview Page).</w:t>
+      </w:r>
+    </w:p>
+    <w:p>
+      <w:pPr>
         <w:pStyle w:val="Heading2"/>
         <w:rPr/>
       </w:pPr>
@@ -401,7 +443,7 @@
       </w:pPr>
       <w:r>
         <w:rPr/>
-        <w:t>Testes automatizados no escopo inicial.</w:t>
+        <w:t>Testes de interface automatizados de ponta a ponta (os testes ABAP Unit de backend são permanentes e fazem parte do escopo; ver seção 25).</w:t>
       </w:r>
     </w:p>
     <w:p>
@@ -4444,7 +4486,7 @@
       </w:pPr>
       <w:r>
         <w:rPr/>
-        <w:t>Cria pedidos em rascunho (draft); depois do registro (Save) o pedido não é editado nem excluído, apenas cancelado.</w:t>
+        <w:t>Cria pedidos em rascunho (draft); depois do registro (Save) só os itens do pedido ABERTO podem ser alterados (Editar + Salvar); o pedido não é excluído, apenas cancelado.</w:t>
       </w:r>
     </w:p>
     <w:p>
@@ -4458,7 +4500,7 @@
       </w:pPr>
       <w:r>
         <w:rPr/>
-        <w:t>Executa SimularPagamento, AprovarPedido e CancelarPedido quando autorizado pelo status.</w:t>
+        <w:t>Executa Efetuar Pagamento (SimularPagamento), Aprovar pedido (AprovarPedido) e Cancelar pedido (CancelarPedido) quando autorizado pelo status.</w:t>
       </w:r>
     </w:p>
     <w:p>
@@ -6020,7 +6062,7 @@
                 <w:szCs w:val="22"/>
                 <w:lang w:val="en-US" w:eastAsia="en-US" w:bidi="ar-SA"/>
               </w:rPr>
-              <w:t>Rascunho; ao salvar o pedido é registrado (CRIADO) e deixa de ser editável.</w:t>
+              <w:t>Rascunho; ao salvar o pedido é registrado (ABERTO); enquanto ABERTO só os itens podem ser editados.</w:t>
             </w:r>
           </w:p>
         </w:tc>
@@ -6089,7 +6131,7 @@
                 <w:szCs w:val="22"/>
                 <w:lang w:val="en-US" w:eastAsia="en-US" w:bidi="ar-SA"/>
               </w:rPr>
-              <w:t>Pagar/Aprovar/Cancelar</w:t>
+              <w:t>Efetuar Pagamento/Aprovar pedido/Cancelar</w:t>
             </w:r>
           </w:p>
         </w:tc>
@@ -11852,7 +11894,7 @@
                 <w:szCs w:val="22"/>
                 <w:lang w:val="en-US" w:eastAsia="en-US" w:bidi="ar-SA"/>
               </w:rPr>
-              <w:t>CEP salvo apenas com números e validado via ViaCEP.</w:t>
+              <w:t>CEP salvo apenas com números e validado via ViaCEP. Faz parte da chave primária da tabela ZTA_PC_ENDERECO: depois que o endereço é gravado o campo fica somente leitura (para trocar o CEP, excluir o endereço e cadastrar outro).</w:t>
             </w:r>
           </w:p>
         </w:tc>
@@ -16270,7 +16312,7 @@
                 <w:szCs w:val="22"/>
                 <w:lang w:val="en-US" w:eastAsia="en-US" w:bidi="ar-SA"/>
               </w:rPr>
-              <w:t>Status do ciclo de vida do pedido.</w:t>
+              <w:t>ABERTO, AGUARDANDO_APROVACAO, PROCESSANDO_REEMBOLSO, CANCELADO ou FINALIZADO.</w:t>
             </w:r>
           </w:p>
         </w:tc>
@@ -16405,7 +16447,7 @@
                 <w:szCs w:val="22"/>
                 <w:lang w:val="en-US" w:eastAsia="en-US" w:bidi="ar-SA"/>
               </w:rPr>
-              <w:t xml:space="preserve">Réplica do status da última tentativa de pagamento (PENDENTE, APROVADO, RECUSADO) para lista e filtros.</w:t>
+              <w:t>Réplica do status do pagamento (PENDENTE, APROVADO, RECUSADO, DEVOLVIDO) para lista e filtros.</w:t>
             </w:r>
           </w:p>
         </w:tc>
@@ -17486,6 +17528,546 @@
                 <w:lang w:val="en-US" w:eastAsia="en-US" w:bidi="ar-SA"/>
               </w:rPr>
               <w:t xml:space="preserve">Data/hora de criação; usada como "Data do pedido" na lista.</w:t>
+            </w:r>
+          </w:p>
+        </w:tc>
+      </w:tr>
+      <w:tr>
+        <w:trPr/>
+        <w:tc>
+          <w:tcPr>
+            <w:tcW w:w="2493" w:type="dxa"/>
+            <w:tcBorders/>
+            <w:vAlign w:val="center"/>
+          </w:tcPr>
+          <w:p>
+            <w:pPr>
+              <w:pStyle w:val="Normal"/>
+              <w:widowControl/>
+              <w:suppressAutoHyphens w:val="true"/>
+              <w:spacing w:lineRule="auto" w:line="240" w:before="0" w:after="0"/>
+              <w:jc w:val="left"/>
+              <w:rPr>
+                <w:rFonts w:cs=""/>
+                <w:kern w:val="0"/>
+                <w:szCs w:val="22"/>
+                <w:lang w:val="en-US" w:eastAsia="en-US" w:bidi="ar-SA"/>
+              </w:rPr>
+            </w:pPr>
+            <w:r>
+              <w:rPr>
+                <w:rFonts w:cs=""/>
+                <w:b/>
+                <w:kern w:val="0"/>
+                <w:sz w:val="17"/>
+                <w:szCs w:val="22"/>
+                <w:lang w:val="en-US" w:eastAsia="en-US" w:bidi="ar-SA"/>
+              </w:rPr>
+              <w:t>PedidoEncerrado</w:t>
+            </w:r>
+          </w:p>
+        </w:tc>
+        <w:tc>
+          <w:tcPr>
+            <w:tcW w:w="2477" w:type="dxa"/>
+            <w:tcBorders/>
+            <w:vAlign w:val="center"/>
+          </w:tcPr>
+          <w:p>
+            <w:pPr>
+              <w:pStyle w:val="Normal"/>
+              <w:widowControl/>
+              <w:suppressAutoHyphens w:val="true"/>
+              <w:spacing w:lineRule="auto" w:line="240" w:before="0" w:after="0"/>
+              <w:jc w:val="left"/>
+              <w:rPr>
+                <w:rFonts w:cs=""/>
+                <w:kern w:val="0"/>
+                <w:szCs w:val="22"/>
+                <w:lang w:val="en-US" w:eastAsia="en-US" w:bidi="ar-SA"/>
+              </w:rPr>
+            </w:pPr>
+            <w:r>
+              <w:rPr>
+                <w:rFonts w:cs=""/>
+                <w:b/>
+                <w:kern w:val="0"/>
+                <w:sz w:val="17"/>
+                <w:szCs w:val="22"/>
+                <w:lang w:val="en-US" w:eastAsia="en-US" w:bidi="ar-SA"/>
+              </w:rPr>
+              <w:t>XFELD</w:t>
+            </w:r>
+          </w:p>
+        </w:tc>
+        <w:tc>
+          <w:tcPr>
+            <w:tcW w:w="2476" w:type="dxa"/>
+            <w:tcBorders/>
+            <w:vAlign w:val="center"/>
+          </w:tcPr>
+          <w:p>
+            <w:pPr>
+              <w:pStyle w:val="Normal"/>
+              <w:widowControl/>
+              <w:suppressAutoHyphens w:val="true"/>
+              <w:spacing w:lineRule="auto" w:line="240" w:before="0" w:after="0"/>
+              <w:jc w:val="left"/>
+              <w:rPr>
+                <w:rFonts w:cs=""/>
+                <w:kern w:val="0"/>
+                <w:szCs w:val="22"/>
+                <w:lang w:val="en-US" w:eastAsia="en-US" w:bidi="ar-SA"/>
+              </w:rPr>
+            </w:pPr>
+            <w:r>
+              <w:rPr>
+                <w:rFonts w:cs=""/>
+                <w:b/>
+                <w:kern w:val="0"/>
+                <w:sz w:val="17"/>
+                <w:szCs w:val="22"/>
+                <w:lang w:val="en-US" w:eastAsia="en-US" w:bidi="ar-SA"/>
+              </w:rPr>
+              <w:t>Sim</w:t>
+            </w:r>
+          </w:p>
+        </w:tc>
+        <w:tc>
+          <w:tcPr>
+            <w:tcW w:w="2479" w:type="dxa"/>
+            <w:tcBorders/>
+            <w:vAlign w:val="center"/>
+          </w:tcPr>
+          <w:p>
+            <w:pPr>
+              <w:pStyle w:val="Normal"/>
+              <w:widowControl/>
+              <w:suppressAutoHyphens w:val="true"/>
+              <w:spacing w:lineRule="auto" w:line="240" w:before="0" w:after="0"/>
+              <w:jc w:val="left"/>
+              <w:rPr>
+                <w:rFonts w:cs=""/>
+                <w:kern w:val="0"/>
+                <w:szCs w:val="22"/>
+                <w:lang w:val="en-US" w:eastAsia="en-US" w:bidi="ar-SA"/>
+              </w:rPr>
+            </w:pPr>
+            <w:r>
+              <w:rPr>
+                <w:rFonts w:cs=""/>
+                <w:b/>
+                <w:kern w:val="0"/>
+                <w:sz w:val="17"/>
+                <w:szCs w:val="22"/>
+                <w:lang w:val="en-US" w:eastAsia="en-US" w:bidi="ar-SA"/>
+              </w:rPr>
+              <w:t>Indicador mantido por AtualizarFlagsStatus: verdadeiro em FINALIZADO e CANCELADO (cliente e itens vêm dos snapshots).</w:t>
+            </w:r>
+          </w:p>
+        </w:tc>
+      </w:tr>
+      <w:tr>
+        <w:trPr/>
+        <w:tc>
+          <w:tcPr>
+            <w:tcW w:w="2493" w:type="dxa"/>
+            <w:tcBorders/>
+            <w:vAlign w:val="center"/>
+          </w:tcPr>
+          <w:p>
+            <w:pPr>
+              <w:pStyle w:val="Normal"/>
+              <w:widowControl/>
+              <w:suppressAutoHyphens w:val="true"/>
+              <w:spacing w:lineRule="auto" w:line="240" w:before="0" w:after="0"/>
+              <w:jc w:val="left"/>
+              <w:rPr>
+                <w:rFonts w:cs=""/>
+                <w:kern w:val="0"/>
+                <w:szCs w:val="22"/>
+                <w:lang w:val="en-US" w:eastAsia="en-US" w:bidi="ar-SA"/>
+              </w:rPr>
+            </w:pPr>
+            <w:r>
+              <w:rPr>
+                <w:rFonts w:cs=""/>
+                <w:b/>
+                <w:kern w:val="0"/>
+                <w:sz w:val="17"/>
+                <w:szCs w:val="22"/>
+                <w:lang w:val="en-US" w:eastAsia="en-US" w:bidi="ar-SA"/>
+              </w:rPr>
+              <w:t>PedidoAtivoSemHistorico</w:t>
+            </w:r>
+          </w:p>
+        </w:tc>
+        <w:tc>
+          <w:tcPr>
+            <w:tcW w:w="2477" w:type="dxa"/>
+            <w:tcBorders/>
+            <w:vAlign w:val="center"/>
+          </w:tcPr>
+          <w:p>
+            <w:pPr>
+              <w:pStyle w:val="Normal"/>
+              <w:widowControl/>
+              <w:suppressAutoHyphens w:val="true"/>
+              <w:spacing w:lineRule="auto" w:line="240" w:before="0" w:after="0"/>
+              <w:jc w:val="left"/>
+              <w:rPr>
+                <w:rFonts w:cs=""/>
+                <w:kern w:val="0"/>
+                <w:szCs w:val="22"/>
+                <w:lang w:val="en-US" w:eastAsia="en-US" w:bidi="ar-SA"/>
+              </w:rPr>
+            </w:pPr>
+            <w:r>
+              <w:rPr>
+                <w:rFonts w:cs=""/>
+                <w:b/>
+                <w:kern w:val="0"/>
+                <w:sz w:val="17"/>
+                <w:szCs w:val="22"/>
+                <w:lang w:val="en-US" w:eastAsia="en-US" w:bidi="ar-SA"/>
+              </w:rPr>
+              <w:t>XFELD</w:t>
+            </w:r>
+          </w:p>
+        </w:tc>
+        <w:tc>
+          <w:tcPr>
+            <w:tcW w:w="2476" w:type="dxa"/>
+            <w:tcBorders/>
+            <w:vAlign w:val="center"/>
+          </w:tcPr>
+          <w:p>
+            <w:pPr>
+              <w:pStyle w:val="Normal"/>
+              <w:widowControl/>
+              <w:suppressAutoHyphens w:val="true"/>
+              <w:spacing w:lineRule="auto" w:line="240" w:before="0" w:after="0"/>
+              <w:jc w:val="left"/>
+              <w:rPr>
+                <w:rFonts w:cs=""/>
+                <w:kern w:val="0"/>
+                <w:szCs w:val="22"/>
+                <w:lang w:val="en-US" w:eastAsia="en-US" w:bidi="ar-SA"/>
+              </w:rPr>
+            </w:pPr>
+            <w:r>
+              <w:rPr>
+                <w:rFonts w:cs=""/>
+                <w:b/>
+                <w:kern w:val="0"/>
+                <w:sz w:val="17"/>
+                <w:szCs w:val="22"/>
+                <w:lang w:val="en-US" w:eastAsia="en-US" w:bidi="ar-SA"/>
+              </w:rPr>
+              <w:t>Sim</w:t>
+            </w:r>
+          </w:p>
+        </w:tc>
+        <w:tc>
+          <w:tcPr>
+            <w:tcW w:w="2479" w:type="dxa"/>
+            <w:tcBorders/>
+            <w:vAlign w:val="center"/>
+          </w:tcPr>
+          <w:p>
+            <w:pPr>
+              <w:pStyle w:val="Normal"/>
+              <w:widowControl/>
+              <w:suppressAutoHyphens w:val="true"/>
+              <w:spacing w:lineRule="auto" w:line="240" w:before="0" w:after="0"/>
+              <w:jc w:val="left"/>
+              <w:rPr>
+                <w:rFonts w:cs=""/>
+                <w:kern w:val="0"/>
+                <w:szCs w:val="22"/>
+                <w:lang w:val="en-US" w:eastAsia="en-US" w:bidi="ar-SA"/>
+              </w:rPr>
+            </w:pPr>
+            <w:r>
+              <w:rPr>
+                <w:rFonts w:cs=""/>
+                <w:b/>
+                <w:kern w:val="0"/>
+                <w:sz w:val="17"/>
+                <w:szCs w:val="22"/>
+                <w:lang w:val="en-US" w:eastAsia="en-US" w:bidi="ar-SA"/>
+              </w:rPr>
+              <w:t>Indicador: verdadeiro nos status que não encerram o pedido (cliente e itens vêm das tabelas principais).</w:t>
+            </w:r>
+          </w:p>
+        </w:tc>
+      </w:tr>
+      <w:tr>
+        <w:trPr/>
+        <w:tc>
+          <w:tcPr>
+            <w:tcW w:w="2493" w:type="dxa"/>
+            <w:tcBorders/>
+            <w:vAlign w:val="center"/>
+          </w:tcPr>
+          <w:p>
+            <w:pPr>
+              <w:pStyle w:val="Normal"/>
+              <w:widowControl/>
+              <w:suppressAutoHyphens w:val="true"/>
+              <w:spacing w:lineRule="auto" w:line="240" w:before="0" w:after="0"/>
+              <w:jc w:val="left"/>
+              <w:rPr>
+                <w:rFonts w:cs=""/>
+                <w:kern w:val="0"/>
+                <w:szCs w:val="22"/>
+                <w:lang w:val="en-US" w:eastAsia="en-US" w:bidi="ar-SA"/>
+              </w:rPr>
+            </w:pPr>
+            <w:r>
+              <w:rPr>
+                <w:rFonts w:cs=""/>
+                <w:b/>
+                <w:kern w:val="0"/>
+                <w:sz w:val="17"/>
+                <w:szCs w:val="22"/>
+                <w:lang w:val="en-US" w:eastAsia="en-US" w:bidi="ar-SA"/>
+              </w:rPr>
+              <w:t>PedidoNaoFinalizado</w:t>
+            </w:r>
+          </w:p>
+        </w:tc>
+        <w:tc>
+          <w:tcPr>
+            <w:tcW w:w="2477" w:type="dxa"/>
+            <w:tcBorders/>
+            <w:vAlign w:val="center"/>
+          </w:tcPr>
+          <w:p>
+            <w:pPr>
+              <w:pStyle w:val="Normal"/>
+              <w:widowControl/>
+              <w:suppressAutoHyphens w:val="true"/>
+              <w:spacing w:lineRule="auto" w:line="240" w:before="0" w:after="0"/>
+              <w:jc w:val="left"/>
+              <w:rPr>
+                <w:rFonts w:cs=""/>
+                <w:kern w:val="0"/>
+                <w:szCs w:val="22"/>
+                <w:lang w:val="en-US" w:eastAsia="en-US" w:bidi="ar-SA"/>
+              </w:rPr>
+            </w:pPr>
+            <w:r>
+              <w:rPr>
+                <w:rFonts w:cs=""/>
+                <w:b/>
+                <w:kern w:val="0"/>
+                <w:sz w:val="17"/>
+                <w:szCs w:val="22"/>
+                <w:lang w:val="en-US" w:eastAsia="en-US" w:bidi="ar-SA"/>
+              </w:rPr>
+              <w:t>XFELD</w:t>
+            </w:r>
+          </w:p>
+        </w:tc>
+        <w:tc>
+          <w:tcPr>
+            <w:tcW w:w="2476" w:type="dxa"/>
+            <w:tcBorders/>
+            <w:vAlign w:val="center"/>
+          </w:tcPr>
+          <w:p>
+            <w:pPr>
+              <w:pStyle w:val="Normal"/>
+              <w:widowControl/>
+              <w:suppressAutoHyphens w:val="true"/>
+              <w:spacing w:lineRule="auto" w:line="240" w:before="0" w:after="0"/>
+              <w:jc w:val="left"/>
+              <w:rPr>
+                <w:rFonts w:cs=""/>
+                <w:kern w:val="0"/>
+                <w:szCs w:val="22"/>
+                <w:lang w:val="en-US" w:eastAsia="en-US" w:bidi="ar-SA"/>
+              </w:rPr>
+            </w:pPr>
+            <w:r>
+              <w:rPr>
+                <w:rFonts w:cs=""/>
+                <w:b/>
+                <w:kern w:val="0"/>
+                <w:sz w:val="17"/>
+                <w:szCs w:val="22"/>
+                <w:lang w:val="en-US" w:eastAsia="en-US" w:bidi="ar-SA"/>
+              </w:rPr>
+              <w:t>Sim</w:t>
+            </w:r>
+          </w:p>
+        </w:tc>
+        <w:tc>
+          <w:tcPr>
+            <w:tcW w:w="2479" w:type="dxa"/>
+            <w:tcBorders/>
+            <w:vAlign w:val="center"/>
+          </w:tcPr>
+          <w:p>
+            <w:pPr>
+              <w:pStyle w:val="Normal"/>
+              <w:widowControl/>
+              <w:suppressAutoHyphens w:val="true"/>
+              <w:spacing w:lineRule="auto" w:line="240" w:before="0" w:after="0"/>
+              <w:jc w:val="left"/>
+              <w:rPr>
+                <w:rFonts w:cs=""/>
+                <w:kern w:val="0"/>
+                <w:szCs w:val="22"/>
+                <w:lang w:val="en-US" w:eastAsia="en-US" w:bidi="ar-SA"/>
+              </w:rPr>
+            </w:pPr>
+            <w:r>
+              <w:rPr>
+                <w:rFonts w:cs=""/>
+                <w:b/>
+                <w:kern w:val="0"/>
+                <w:sz w:val="17"/>
+                <w:szCs w:val="22"/>
+                <w:lang w:val="en-US" w:eastAsia="en-US" w:bidi="ar-SA"/>
+              </w:rPr>
+              <w:t>Indicador usado em hidden: #(PedidoNaoFinalizado) para ocultar a seção Finalização quando o pedido não está FINALIZADO.</w:t>
+            </w:r>
+          </w:p>
+        </w:tc>
+      </w:tr>
+      <w:tr>
+        <w:trPr/>
+        <w:tc>
+          <w:tcPr>
+            <w:tcW w:w="2493" w:type="dxa"/>
+            <w:tcBorders/>
+            <w:vAlign w:val="center"/>
+          </w:tcPr>
+          <w:p>
+            <w:pPr>
+              <w:pStyle w:val="Normal"/>
+              <w:widowControl/>
+              <w:suppressAutoHyphens w:val="true"/>
+              <w:spacing w:lineRule="auto" w:line="240" w:before="0" w:after="0"/>
+              <w:jc w:val="left"/>
+              <w:rPr>
+                <w:rFonts w:cs=""/>
+                <w:kern w:val="0"/>
+                <w:szCs w:val="22"/>
+                <w:lang w:val="en-US" w:eastAsia="en-US" w:bidi="ar-SA"/>
+              </w:rPr>
+            </w:pPr>
+            <w:r>
+              <w:rPr>
+                <w:rFonts w:cs=""/>
+                <w:b/>
+                <w:kern w:val="0"/>
+                <w:sz w:val="17"/>
+                <w:szCs w:val="22"/>
+                <w:lang w:val="en-US" w:eastAsia="en-US" w:bidi="ar-SA"/>
+              </w:rPr>
+              <w:t>PedidoNaoCancelado</w:t>
+            </w:r>
+          </w:p>
+        </w:tc>
+        <w:tc>
+          <w:tcPr>
+            <w:tcW w:w="2477" w:type="dxa"/>
+            <w:tcBorders/>
+            <w:vAlign w:val="center"/>
+          </w:tcPr>
+          <w:p>
+            <w:pPr>
+              <w:pStyle w:val="Normal"/>
+              <w:widowControl/>
+              <w:suppressAutoHyphens w:val="true"/>
+              <w:spacing w:lineRule="auto" w:line="240" w:before="0" w:after="0"/>
+              <w:jc w:val="left"/>
+              <w:rPr>
+                <w:rFonts w:cs=""/>
+                <w:kern w:val="0"/>
+                <w:szCs w:val="22"/>
+                <w:lang w:val="en-US" w:eastAsia="en-US" w:bidi="ar-SA"/>
+              </w:rPr>
+            </w:pPr>
+            <w:r>
+              <w:rPr>
+                <w:rFonts w:cs=""/>
+                <w:b/>
+                <w:kern w:val="0"/>
+                <w:sz w:val="17"/>
+                <w:szCs w:val="22"/>
+                <w:lang w:val="en-US" w:eastAsia="en-US" w:bidi="ar-SA"/>
+              </w:rPr>
+              <w:t>XFELD</w:t>
+            </w:r>
+          </w:p>
+        </w:tc>
+        <w:tc>
+          <w:tcPr>
+            <w:tcW w:w="2476" w:type="dxa"/>
+            <w:tcBorders/>
+            <w:vAlign w:val="center"/>
+          </w:tcPr>
+          <w:p>
+            <w:pPr>
+              <w:pStyle w:val="Normal"/>
+              <w:widowControl/>
+              <w:suppressAutoHyphens w:val="true"/>
+              <w:spacing w:lineRule="auto" w:line="240" w:before="0" w:after="0"/>
+              <w:jc w:val="left"/>
+              <w:rPr>
+                <w:rFonts w:cs=""/>
+                <w:kern w:val="0"/>
+                <w:szCs w:val="22"/>
+                <w:lang w:val="en-US" w:eastAsia="en-US" w:bidi="ar-SA"/>
+              </w:rPr>
+            </w:pPr>
+            <w:r>
+              <w:rPr>
+                <w:rFonts w:cs=""/>
+                <w:b/>
+                <w:kern w:val="0"/>
+                <w:sz w:val="17"/>
+                <w:szCs w:val="22"/>
+                <w:lang w:val="en-US" w:eastAsia="en-US" w:bidi="ar-SA"/>
+              </w:rPr>
+              <w:t>Sim</w:t>
+            </w:r>
+          </w:p>
+        </w:tc>
+        <w:tc>
+          <w:tcPr>
+            <w:tcW w:w="2479" w:type="dxa"/>
+            <w:tcBorders/>
+            <w:vAlign w:val="center"/>
+          </w:tcPr>
+          <w:p>
+            <w:pPr>
+              <w:pStyle w:val="Normal"/>
+              <w:widowControl/>
+              <w:suppressAutoHyphens w:val="true"/>
+              <w:spacing w:lineRule="auto" w:line="240" w:before="0" w:after="0"/>
+              <w:jc w:val="left"/>
+              <w:rPr>
+                <w:rFonts w:cs=""/>
+                <w:kern w:val="0"/>
+                <w:szCs w:val="22"/>
+                <w:lang w:val="en-US" w:eastAsia="en-US" w:bidi="ar-SA"/>
+              </w:rPr>
+            </w:pPr>
+            <w:r>
+              <w:rPr>
+                <w:rFonts w:cs=""/>
+                <w:b/>
+                <w:kern w:val="0"/>
+                <w:sz w:val="17"/>
+                <w:szCs w:val="22"/>
+                <w:lang w:val="en-US" w:eastAsia="en-US" w:bidi="ar-SA"/>
+              </w:rPr>
+              <w:t>Indicador usado em hidden: #(PedidoNaoCancelado) para ocultar a seção Cancelamento quando o pedido não está CANCELADO.</w:t>
             </w:r>
           </w:p>
         </w:tc>
@@ -19473,7 +20055,7 @@
                 <w:szCs w:val="22"/>
                 <w:lang w:val="en-US" w:eastAsia="en-US" w:bidi="ar-SA"/>
               </w:rPr>
-              <w:t>PENDENTE, APROVADO ou RECUSADO.</w:t>
+              <w:t>PENDENTE, APROVADO, RECUSADO ou DEVOLVIDO (quando o reembolso do pedido é aprovado).</w:t>
             </w:r>
           </w:p>
         </w:tc>
@@ -22716,7 +23298,7 @@
       </w:pPr>
       <w:r>
         <w:rPr/>
-        <w:t xml:space="preserve">Validações: CPF (dígitos e unicidade), dados obrigatórios, e-mail, telefone, gênero, foto, data de nascimento, número obrigatório e CEP.</w:t>
+        <w:t>Validações: CPF (dígitos e unicidade), dados obrigatórios, e-mail, telefone, gênero, foto, data de nascimento, número obrigatório e CEP. O CEP de endereço já gravado é somente leitura (field ( features : instance ) Cep), porque faz parte da chave primária da tabela; sem isso a alteração gerava RAISE_SHORTDUMP (UPDATE com sy-subrc 4).</w:t>
       </w:r>
     </w:p>
     <w:p>
@@ -22960,7 +23542,7 @@
       </w:pPr>
       <w:r>
         <w:rPr/>
-        <w:t>Draft habilitado para a criação do pedido. Ao salvar (Prepare + Activate) o pedido é registrado como instância ativa em CRIADO e o estoque dos itens é reservado; o pedido ativo não é editado nem excluído e itens só entram no rascunho. As actions do ciclo de vida são executadas apenas sobre a instância ativa.</w:t>
+        <w:t>Draft habilitado para a criação e para a edição dos itens do pedido ABERTO. Ao salvar (Prepare + Activate) o pedido é registrado como instância ativa em ABERTO e o estoque dos itens é reservado. Enquanto ABERTO só os itens podem ser alterados (ClienteUUID é obrigatório na criação e somente leitura na atualização) e a reserva é ajustada pela diferença (determination ReservarEstoqueRegistro on { create; update; } e implementação adicional de Activate, que cobre a remoção de itens). Nos demais status o pedido não é editado nem excluído. As actions do ciclo de vida são executadas apenas sobre a instância ativa.</w:t>
       </w:r>
     </w:p>
     <w:p>
@@ -22974,7 +23556,21 @@
       </w:pPr>
       <w:r>
         <w:rPr/>
-        <w:t>Actions públicas: SimularPagamento (parâmetro ZPC_A_PAGAMENTO_INPUT), AprovarPedido e CancelarPedido (parâmetro ZPC_A_CANCELAMENTO_INPUT). Actions internas: RecalcularTotal e, chamadas pelo BO Reembolso via EML (authorization : none), CancelarPorReembolso e RetomarPedido (parâmetro ZPC_A_RETOMADA_INPUT).</w:t>
+        <w:t>Actions públicas: SimularPagamento (rótulo Efetuar Pagamento; parâmetro ZPC_A_PAGAMENTO_INPUT), AprovarPedido (rótulo Aprovar pedido) e CancelarPedido (parâmetro ZPC_A_CANCELAMENTO_INPUT). Actions internas: RecalcularTotal e, chamadas pelo BO Reembolso via EML (authorization : none), CancelarPorReembolso e RetomarPedido (parâmetro ZPC_A_RETOMADA_INPUT).</w:t>
+      </w:r>
+    </w:p>
+    <w:p>
+      <w:pPr>
+        <w:pStyle w:val="ListBullet"/>
+        <w:numPr>
+          <w:ilvl w:val="0"/>
+          <w:numId w:val="1"/>
+        </w:numPr>
+        <w:rPr/>
+      </w:pPr>
+      <w:r>
+        <w:rPr/>
+        <w:t>Object Page dinâmica: a determination AtualizarFlagsStatus (on modify { create; field StatusPedido; }) mantém as colunas persistidas PedidoEncerrado, PedidoAtivoSemHistorico, PedidoNaoFinalizado e PedidoNaoCancelado, usadas em @UI.facet com hidden: #(Campo) no DDLX ZC_PC_PEDIDO_APP (ver seção 15.4).</w:t>
       </w:r>
     </w:p>
     <w:p>
@@ -24187,7 +24783,7 @@
       </w:pPr>
       <w:r>
         <w:rPr/>
-        <w:t>Status inicial do pedido será CRIADO.</w:t>
+        <w:t>Status inicial do pedido será ABERTO.</w:t>
       </w:r>
     </w:p>
     <w:p>
@@ -24215,7 +24811,7 @@
       </w:pPr>
       <w:r>
         <w:rPr/>
-        <w:t>A reserva de estoque ocorre no registro do pedido (Save do rascunho, quando o pedido passa a existir como CRIADO); não há action de confirmação.</w:t>
+        <w:t>A reserva de estoque ocorre no registro do pedido (Save do rascunho, quando o pedido passa a existir como ABERTO); não há action de confirmação. Enquanto o pedido está ABERTO, incluir, remover ou alterar itens ajusta a reserva pela diferença.</w:t>
       </w:r>
     </w:p>
     <w:p>
@@ -24299,7 +24895,7 @@
       </w:pPr>
       <w:r>
         <w:rPr/>
-        <w:t>O pedido registrado (instância ativa) não pode ser editado nem excluído, e itens só podem ser incluídos no rascunho; alterações exigem cancelamento e novo pedido.</w:t>
+        <w:t>Pedido ABERTO: somente os itens podem ser alterados (incluir, remover, mudar a quantidade) e o cliente não pode ser trocado. Pedidos AGUARDANDO_APROVACAO, PROCESSANDO_REEMBOLSO, FINALIZADO e CANCELADO não são editados nem excluídos.</w:t>
       </w:r>
     </w:p>
     <w:p>
@@ -24327,7 +24923,7 @@
       </w:pPr>
       <w:r>
         <w:rPr/>
-        <w:t>Cancelar um pedido com pagamento aprovado não o cancela diretamente: cria uma solicitação de reembolso PENDENTE e leva o pedido a PROCESSAR_REEMBOLSO, mantendo a reserva de estoque até a decisão.</w:t>
+        <w:t>Cancelar um pedido com pagamento aprovado não o cancela diretamente: cria uma solicitação de reembolso PENDENTE e leva o pedido a PROCESSANDO_REEMBOLSO, mantendo a reserva de estoque até a decisão.</w:t>
       </w:r>
     </w:p>
     <w:p>
@@ -24375,7 +24971,7 @@
       </w:pPr>
       <w:r>
         <w:rPr/>
-        <w:t>O fluxo principal é CRIADO (registro do pedido, com reserva de estoque) → AGUARDANDO_APROVACAO (pagamento aprovado) → FINALIZADO. Pagamento recusado leva ou mantém o pedido em AGUARDANDO_PAGAMENTO, com nova tentativa permitida. Cancelamentos são permitidos em CRIADO, AGUARDANDO_PAGAMENTO e AGUARDANDO_APROVACAO; com pagamento aprovado o cancelamento passa por PROCESSAR_REEMBOLSO.</w:t>
+        <w:t>O fluxo principal é ABERTO (registro do pedido, com reserva de estoque) → AGUARDANDO_APROVACAO (pagamento aprovado) → FINALIZADO. Pagamento recusado mantém o pedido em ABERTO, com nova tentativa permitida. O cancelamento é permitido em ABERTO e AGUARDANDO_APROVACAO; com pagamento aprovado o cancelamento passa por PROCESSANDO_REEMBOLSO. Status do pagamento: PENDENTE, APROVADO, RECUSADO e DEVOLVIDO.</w:t>
       </w:r>
     </w:p>
     <w:tbl>
@@ -24573,7 +25169,7 @@
                 <w:szCs w:val="22"/>
                 <w:lang w:val="en-US" w:eastAsia="en-US" w:bidi="ar-SA"/>
               </w:rPr>
-              <w:t>CRIADO</w:t>
+              <w:t>(início)</w:t>
             </w:r>
           </w:p>
         </w:tc>
@@ -24606,7 +25202,7 @@
                 <w:szCs w:val="22"/>
                 <w:lang w:val="en-US" w:eastAsia="en-US" w:bidi="ar-SA"/>
               </w:rPr>
-              <w:t>AGUARDANDO_PAGAMENTO</w:t>
+              <w:t>ABERTO</w:t>
             </w:r>
           </w:p>
         </w:tc>
@@ -24672,7 +25268,7 @@
                 <w:szCs w:val="22"/>
                 <w:lang w:val="en-US" w:eastAsia="en-US" w:bidi="ar-SA"/>
               </w:rPr>
-              <w:t>Pagamento simulado recusado; nova tentativa permitida.</w:t>
+              <w:t>Save do rascunho: registra o pedido, gera o número e reserva o estoque.</w:t>
             </w:r>
           </w:p>
         </w:tc>
@@ -24708,7 +25304,7 @@
                 <w:szCs w:val="22"/>
                 <w:lang w:val="en-US" w:eastAsia="en-US" w:bidi="ar-SA"/>
               </w:rPr>
-              <w:t>CRIADO / AGUARDANDO_PAGAMENTO</w:t>
+              <w:t>ABERTO</w:t>
             </w:r>
           </w:p>
         </w:tc>
@@ -24741,7 +25337,7 @@
                 <w:szCs w:val="22"/>
                 <w:lang w:val="en-US" w:eastAsia="en-US" w:bidi="ar-SA"/>
               </w:rPr>
-              <w:t>AGUARDANDO_APROVACAO</w:t>
+              <w:t>ABERTO</w:t>
             </w:r>
           </w:p>
         </w:tc>
@@ -24807,7 +25403,7 @@
                 <w:szCs w:val="22"/>
                 <w:lang w:val="en-US" w:eastAsia="en-US" w:bidi="ar-SA"/>
               </w:rPr>
-              <w:t>Pagamento simulado aprovado.</w:t>
+              <w:t>Editar itens (Editar + Salvar) ajusta a reserva pela diferença; pagamento recusado mantém o status e permite nova tentativa.</w:t>
             </w:r>
           </w:p>
         </w:tc>
@@ -24843,7 +25439,7 @@
                 <w:szCs w:val="22"/>
                 <w:lang w:val="en-US" w:eastAsia="en-US" w:bidi="ar-SA"/>
               </w:rPr>
-              <w:t>AGUARDANDO_PAGAMENTO</w:t>
+              <w:t>ABERTO</w:t>
             </w:r>
           </w:p>
         </w:tc>
@@ -24876,7 +25472,7 @@
                 <w:szCs w:val="22"/>
                 <w:lang w:val="en-US" w:eastAsia="en-US" w:bidi="ar-SA"/>
               </w:rPr>
-              <w:t>AGUARDANDO_PAGAMENTO</w:t>
+              <w:t>AGUARDANDO_APROVACAO</w:t>
             </w:r>
           </w:p>
         </w:tc>
@@ -24942,7 +25538,7 @@
                 <w:szCs w:val="22"/>
                 <w:lang w:val="en-US" w:eastAsia="en-US" w:bidi="ar-SA"/>
               </w:rPr>
-              <w:t>Pagamento recusado; nova tentativa permitida.</w:t>
+              <w:t>Efetuar Pagamento aprovado.</w:t>
             </w:r>
           </w:p>
         </w:tc>
@@ -25077,7 +25673,7 @@
                 <w:szCs w:val="22"/>
                 <w:lang w:val="en-US" w:eastAsia="en-US" w:bidi="ar-SA"/>
               </w:rPr>
-              <w:t>Action AprovarPedido executada com sucesso.</w:t>
+              <w:t>Aprovar pedido: baixa o estoque, gera snapshots e finaliza.</w:t>
             </w:r>
           </w:p>
         </w:tc>
@@ -25113,7 +25709,7 @@
                 <w:szCs w:val="22"/>
                 <w:lang w:val="en-US" w:eastAsia="en-US" w:bidi="ar-SA"/>
               </w:rPr>
-              <w:t>CRIADO</w:t>
+              <w:t>ABERTO</w:t>
             </w:r>
           </w:p>
         </w:tc>
@@ -25212,7 +25808,7 @@
                 <w:szCs w:val="22"/>
                 <w:lang w:val="en-US" w:eastAsia="en-US" w:bidi="ar-SA"/>
               </w:rPr>
-              <w:t xml:space="preserve">Cancelamento com motivo; não há reserva a liberar; gera snapshot.</w:t>
+              <w:t>Cancelamento com motivo; libera a reserva e gera snapshots.</w:t>
             </w:r>
           </w:p>
         </w:tc>
@@ -25248,7 +25844,7 @@
                 <w:szCs w:val="22"/>
                 <w:lang w:val="en-US" w:eastAsia="en-US" w:bidi="ar-SA"/>
               </w:rPr>
-              <w:t>AGUARDANDO_PAGAMENTO</w:t>
+              <w:t>AGUARDANDO_APROVACAO</w:t>
             </w:r>
           </w:p>
         </w:tc>
@@ -25281,7 +25877,7 @@
                 <w:szCs w:val="22"/>
                 <w:lang w:val="en-US" w:eastAsia="en-US" w:bidi="ar-SA"/>
               </w:rPr>
-              <w:t>CANCELADO</w:t>
+              <w:t>PROCESSANDO_REEMBOLSO</w:t>
             </w:r>
           </w:p>
         </w:tc>
@@ -25347,7 +25943,7 @@
                 <w:szCs w:val="22"/>
                 <w:lang w:val="en-US" w:eastAsia="en-US" w:bidi="ar-SA"/>
               </w:rPr>
-              <w:t>Libera reserva e gera snapshot.</w:t>
+              <w:t>CancelarPedido com pagamento aprovado: cria a solicitação de reembolso (PENDENTE); a reserva é mantida.</w:t>
             </w:r>
           </w:p>
         </w:tc>
@@ -25383,7 +25979,7 @@
                 <w:szCs w:val="22"/>
                 <w:lang w:val="en-US" w:eastAsia="en-US" w:bidi="ar-SA"/>
               </w:rPr>
-              <w:t>AGUARDANDO_APROVACAO</w:t>
+              <w:t>PROCESSANDO_REEMBOLSO</w:t>
             </w:r>
           </w:p>
         </w:tc>
@@ -25416,7 +26012,7 @@
                 <w:szCs w:val="22"/>
                 <w:lang w:val="en-US" w:eastAsia="en-US" w:bidi="ar-SA"/>
               </w:rPr>
-              <w:t>PROCESSAR_REEMBOLSO</w:t>
+              <w:t>CANCELADO</w:t>
             </w:r>
           </w:p>
         </w:tc>
@@ -25482,7 +26078,7 @@
                 <w:szCs w:val="22"/>
                 <w:lang w:val="en-US" w:eastAsia="en-US" w:bidi="ar-SA"/>
               </w:rPr>
-              <w:t>CancelarPedido com pagamento aprovado: cria a solicitação de reembolso (PENDENTE); a reserva é mantida.</w:t>
+              <w:t>Action AprovarReembolso: libera a reserva, gera os snapshots e muda o pagamento para DEVOLVIDO.</w:t>
             </w:r>
           </w:p>
         </w:tc>
@@ -25518,7 +26114,7 @@
                 <w:szCs w:val="22"/>
                 <w:lang w:val="en-US" w:eastAsia="en-US" w:bidi="ar-SA"/>
               </w:rPr>
-              <w:t>PROCESSAR_REEMBOLSO</w:t>
+              <w:t>PROCESSANDO_REEMBOLSO</w:t>
             </w:r>
           </w:p>
         </w:tc>
@@ -25551,7 +26147,7 @@
                 <w:szCs w:val="22"/>
                 <w:lang w:val="en-US" w:eastAsia="en-US" w:bidi="ar-SA"/>
               </w:rPr>
-              <w:t>CANCELADO</w:t>
+              <w:t>Status anterior (AGUARDANDO_APROVACAO)</w:t>
             </w:r>
           </w:p>
         </w:tc>
@@ -25617,7 +26213,7 @@
                 <w:szCs w:val="22"/>
                 <w:lang w:val="en-US" w:eastAsia="en-US" w:bidi="ar-SA"/>
               </w:rPr>
-              <w:t>Action AprovarReembolso: libera a reserva e gera os snapshots.</w:t>
+              <w:t>Action RejeitarReembolso (motivo obrigatório): o pedido retoma o status anterior à solicitação.</w:t>
             </w:r>
           </w:p>
         </w:tc>
@@ -25653,7 +26249,7 @@
                 <w:szCs w:val="22"/>
                 <w:lang w:val="en-US" w:eastAsia="en-US" w:bidi="ar-SA"/>
               </w:rPr>
-              <w:t>PROCESSAR_REEMBOLSO</w:t>
+              <w:t>ABERTO</w:t>
             </w:r>
           </w:p>
         </w:tc>
@@ -25686,7 +26282,7 @@
                 <w:szCs w:val="22"/>
                 <w:lang w:val="en-US" w:eastAsia="en-US" w:bidi="ar-SA"/>
               </w:rPr>
-              <w:t>Status anterior (AGUARDANDO_APROVACAO)</w:t>
+              <w:t>AGUARDANDO_APROVACAO sem pagamento</w:t>
             </w:r>
           </w:p>
         </w:tc>
@@ -25719,7 +26315,7 @@
                 <w:szCs w:val="22"/>
                 <w:lang w:val="en-US" w:eastAsia="en-US" w:bidi="ar-SA"/>
               </w:rPr>
-              <w:t>Sim</w:t>
+              <w:t>Não</w:t>
             </w:r>
           </w:p>
         </w:tc>
@@ -25752,7 +26348,7 @@
                 <w:szCs w:val="22"/>
                 <w:lang w:val="en-US" w:eastAsia="en-US" w:bidi="ar-SA"/>
               </w:rPr>
-              <w:t>Action RejeitarReembolso (motivo obrigatório): o pedido retoma o status anterior à solicitação.</w:t>
+              <w:t>Aprovar pedido exige pagamento aprovado.</w:t>
             </w:r>
           </w:p>
         </w:tc>
@@ -25821,7 +26417,7 @@
                 <w:szCs w:val="22"/>
                 <w:lang w:val="en-US" w:eastAsia="en-US" w:bidi="ar-SA"/>
               </w:rPr>
-              <w:t>CRIADO</w:t>
+              <w:t>ABERTO</w:t>
             </w:r>
           </w:p>
         </w:tc>
@@ -25956,7 +26552,7 @@
                 <w:szCs w:val="22"/>
                 <w:lang w:val="en-US" w:eastAsia="en-US" w:bidi="ar-SA"/>
               </w:rPr>
-              <w:t>CANCELADO/CRIADO</w:t>
+              <w:t>CANCELADO/ABERTO</w:t>
             </w:r>
           </w:p>
         </w:tc>
@@ -26138,7 +26734,7 @@
       </w:pPr>
       <w:r>
         <w:rPr/>
-        <w:t>Ativar o rascunho: o pedido passa a existir como instância ativa em CRIADO, com NumeroPedido.</w:t>
+        <w:t>Ativar o rascunho: o pedido passa a existir como instância ativa em ABERTO, com NumeroPedido.</w:t>
       </w:r>
     </w:p>
     <w:p>
@@ -26396,7 +26992,7 @@
       </w:pPr>
       <w:r>
         <w:rPr/>
-        <w:t>Se StatusPagamento = APROVADO: criar a solicitação de Reembolso (PENDENTE), mover o pedido para PROCESSAR_REEMBOLSO e manter a reserva; os passos seguintes só são executados na aprovação do reembolso (seção 12.4).</w:t>
+        <w:t>Se StatusPagamento = APROVADO: criar a solicitação de Reembolso (PENDENTE), mover o pedido para PROCESSANDO_REEMBOLSO e manter a reserva; os passos seguintes só são executados na aprovação do reembolso (seção 12.4).</w:t>
       </w:r>
     </w:p>
     <w:p>
@@ -26490,7 +27086,7 @@
       </w:pPr>
       <w:r>
         <w:rPr/>
-        <w:t>Solicitação: CancelarPedido com StatusPagamento = APROVADO cria o Reembolso (PENDENTE, com StatusPedidoAnterior e motivo) e move o pedido para PROCESSAR_REEMBOLSO.</w:t>
+        <w:t>Solicitação: CancelarPedido com StatusPagamento = APROVADO cria o Reembolso (PENDENTE, com StatusPedidoAnterior e motivo) e move o pedido para PROCESSANDO_REEMBOLSO.</w:t>
       </w:r>
     </w:p>
     <w:p>
@@ -27099,6 +27695,100 @@
     </w:p>
     <w:p>
       <w:pPr>
+        <w:pStyle w:val="Heading2"/>
+        <w:rPr/>
+      </w:pPr>
+      <w:r>
+        <w:rPr/>
+        <w:t>12.7 Edição dos Itens do Pedido ABERTO</w:t>
+      </w:r>
+    </w:p>
+    <w:p>
+      <w:pPr>
+        <w:pStyle w:val="ListBullet"/>
+        <w:numPr>
+          <w:ilvl w:val="0"/>
+          <w:numId w:val="1"/>
+        </w:numPr>
+        <w:rPr/>
+      </w:pPr>
+      <w:r>
+        <w:rPr/>
+        <w:t>Em pedido ABERTO a opção Editar cria um rascunho com os itens atuais; o cliente (ClienteUUID) é somente leitura.</w:t>
+      </w:r>
+    </w:p>
+    <w:p>
+      <w:pPr>
+        <w:pStyle w:val="ListBullet"/>
+        <w:numPr>
+          <w:ilvl w:val="0"/>
+          <w:numId w:val="1"/>
+        </w:numPr>
+        <w:rPr/>
+      </w:pPr>
+      <w:r>
+        <w:rPr/>
+        <w:t>Ao salvar, a reserva é recalculada pela diferença entre o que o pedido já reservou (lido do banco, na entidade de itens do pedido) e os itens do rascunho: reserva só o acréscimo e libera só o excedente (actions ReservarEstoque e LiberarReserva do BO Item, sob lock).</w:t>
+      </w:r>
+    </w:p>
+    <w:p>
+      <w:pPr>
+        <w:pStyle w:val="ListBullet"/>
+        <w:numPr>
+          <w:ilvl w:val="0"/>
+          <w:numId w:val="1"/>
+        </w:numPr>
+        <w:rPr/>
+      </w:pPr>
+      <w:r>
+        <w:rPr/>
+        <w:t>Remover um item não dispara determination: a implementação adicional de Activate (draft action Activate with additional implementation) libera a reserva do item removido.</w:t>
+      </w:r>
+    </w:p>
+    <w:p>
+      <w:pPr>
+        <w:pStyle w:val="ListBullet"/>
+        <w:numPr>
+          <w:ilvl w:val="0"/>
+          <w:numId w:val="1"/>
+        </w:numPr>
+        <w:rPr/>
+      </w:pPr>
+      <w:r>
+        <w:rPr/>
+        <w:t>O estado aplicado é registrado (gt_reserva e gt_reserva_ped) antes de qualquer MODIFY, para evitar o dump "stack of on-modify determinations being too deep".</w:t>
+      </w:r>
+    </w:p>
+    <w:p>
+      <w:pPr>
+        <w:pStyle w:val="ListBullet"/>
+        <w:numPr>
+          <w:ilvl w:val="0"/>
+          <w:numId w:val="1"/>
+        </w:numPr>
+        <w:rPr/>
+      </w:pPr>
+      <w:r>
+        <w:rPr/>
+        <w:t>Quantidade acima do disponível (considerando o que o próprio pedido já reservou) bloqueia o Save (ValidarRegistro); nunca se reserva além do estoque.</w:t>
+      </w:r>
+    </w:p>
+    <w:p>
+      <w:pPr>
+        <w:pStyle w:val="ListBullet"/>
+        <w:numPr>
+          <w:ilvl w:val="0"/>
+          <w:numId w:val="1"/>
+        </w:numPr>
+        <w:rPr/>
+      </w:pPr>
+      <w:r>
+        <w:rPr/>
+        <w:t>Cancelar o pedido ABERTO libera toda a reserva restante.</w:t>
+      </w:r>
+    </w:p>
+    <w:p>
+      <w:pPr>
         <w:pStyle w:val="Heading1"/>
         <w:rPr/>
       </w:pPr>
@@ -27132,7 +27822,7 @@
       </w:pPr>
       <w:r>
         <w:rPr/>
-        <w:t>Usar número, validade e CVV apenas em memória durante SimularPagamento.</w:t>
+        <w:t>Usar número, validade e CVV apenas em memória durante SimularPagamento (rótulo Efetuar Pagamento).</w:t>
       </w:r>
     </w:p>
     <w:p>
@@ -27272,7 +27962,21 @@
       </w:pPr>
       <w:r>
         <w:rPr/>
-        <w:t>Pagamento recusado leva (ou mantém) o pedido em AGUARDANDO_PAGAMENTO e permite nova tentativa.</w:t>
+        <w:t>Pagamento recusado mantém o pedido em ABERTO (StatusPagamento = RECUSADO) e permite nova tentativa.</w:t>
+      </w:r>
+    </w:p>
+    <w:p>
+      <w:pPr>
+        <w:pStyle w:val="ListBullet"/>
+        <w:numPr>
+          <w:ilvl w:val="0"/>
+          <w:numId w:val="1"/>
+        </w:numPr>
+        <w:rPr/>
+      </w:pPr>
+      <w:r>
+        <w:rPr/>
+        <w:t>Quando o reembolso do pedido é aprovado, o pagamento passa a DEVOLVIDO (registro do pagamento e réplica no pedido).</w:t>
       </w:r>
     </w:p>
     <w:p>
@@ -28407,7 +29111,7 @@
                 <w:szCs w:val="22"/>
                 <w:lang w:val="en-US" w:eastAsia="en-US" w:bidi="ar-SA"/>
               </w:rPr>
-              <w:t>SimularPagamento, AprovarPedido, CancelarPedido</w:t>
+              <w:t>Efetuar Pagamento (SimularPagamento), Aprovar pedido (AprovarPedido), Cancelar pedido (CancelarPedido)</w:t>
             </w:r>
           </w:p>
         </w:tc>
@@ -28440,7 +29144,7 @@
                 <w:szCs w:val="22"/>
                 <w:lang w:val="en-US" w:eastAsia="en-US" w:bidi="ar-SA"/>
               </w:rPr>
-              <w:t>Ações disponíveis por status (feature control) e perfil (global authorization), somente na instância ativa. O pedido ativo não oferece Editar nem Excluir.</w:t>
+              <w:t>Ações disponíveis por status (feature control) e perfil (global authorization), somente na instância ativa. O pedido ativo não oferece Excluir; Editar só no status ABERTO (apenas os itens).</w:t>
             </w:r>
           </w:p>
         </w:tc>
@@ -28649,6 +29353,100 @@
       <w:r>
         <w:rPr/>
         <w:t>Bloquear o Save (registro do pedido) se o cliente não possuir endereço principal válido.</w:t>
+      </w:r>
+    </w:p>
+    <w:p>
+      <w:pPr>
+        <w:pStyle w:val="Heading2"/>
+        <w:rPr/>
+      </w:pPr>
+      <w:r>
+        <w:rPr/>
+        <w:t>15.4 Object Page Dinâmica do Pedido</w:t>
+      </w:r>
+    </w:p>
+    <w:p>
+      <w:pPr>
+        <w:pStyle w:val="ListBullet"/>
+        <w:numPr>
+          <w:ilvl w:val="0"/>
+          <w:numId w:val="1"/>
+        </w:numPr>
+        <w:rPr/>
+      </w:pPr>
+      <w:r>
+        <w:rPr/>
+        <w:t>Ordem das seções: 1. Dados do Cliente, 2. Dados do Pedido (inclui os campos administrativos; não há mais seção "Dados administrativos"), 3. Itens, 4. Pagamento, 5. Finalização ou Cancelamento.</w:t>
+      </w:r>
+    </w:p>
+    <w:p>
+      <w:pPr>
+        <w:pStyle w:val="ListBullet"/>
+        <w:numPr>
+          <w:ilvl w:val="0"/>
+          <w:numId w:val="1"/>
+        </w:numPr>
+        <w:rPr/>
+      </w:pPr>
+      <w:r>
+        <w:rPr/>
+        <w:t>As seções Finalização e Cancelamento aparecem apenas nos status FINALIZADO e CANCELADO, respectivamente (hidden: #(PedidoNaoFinalizado) e hidden: #(PedidoNaoCancelado) na @UI.facet).</w:t>
+      </w:r>
+    </w:p>
+    <w:p>
+      <w:pPr>
+        <w:pStyle w:val="ListBullet"/>
+        <w:numPr>
+          <w:ilvl w:val="0"/>
+          <w:numId w:val="1"/>
+        </w:numPr>
+        <w:rPr/>
+      </w:pPr>
+      <w:r>
+        <w:rPr/>
+        <w:t>Não há seções "Histórico - cliente" e "Histórico - itens": Dados do Cliente e Itens têm a mesma estrutura em todos os status; a fonte dos dados é que muda.</w:t>
+      </w:r>
+    </w:p>
+    <w:p>
+      <w:pPr>
+        <w:pStyle w:val="ListBullet"/>
+        <w:numPr>
+          <w:ilvl w:val="0"/>
+          <w:numId w:val="1"/>
+        </w:numPr>
+        <w:rPr/>
+      </w:pPr>
+      <w:r>
+        <w:rPr/>
+        <w:t>Pedido FINALIZADO ou CANCELADO: cliente e itens vêm das tabelas de snapshot (ZTA_PC_SNAP_CLI e ZTA_PC_SNAP_ITM), imutáveis.</w:t>
+      </w:r>
+    </w:p>
+    <w:p>
+      <w:pPr>
+        <w:pStyle w:val="ListBullet"/>
+        <w:numPr>
+          <w:ilvl w:val="0"/>
+          <w:numId w:val="1"/>
+        </w:numPr>
+        <w:rPr/>
+      </w:pPr>
+      <w:r>
+        <w:rPr/>
+        <w:t>Pedido ABERTO, AGUARDANDO_APROVACAO ou PROCESSANDO_REEMBOLSO: cliente e itens vêm das tabelas principais (ativas).</w:t>
+      </w:r>
+    </w:p>
+    <w:p>
+      <w:pPr>
+        <w:pStyle w:val="ListBullet"/>
+        <w:numPr>
+          <w:ilvl w:val="0"/>
+          <w:numId w:val="1"/>
+        </w:numPr>
+        <w:rPr/>
+      </w:pPr>
+      <w:r>
+        <w:rPr/>
+        <w:t>Os indicadores (PedidoEncerrado, PedidoAtivoSemHistorico, PedidoNaoFinalizado, PedidoNaoCancelado) são colunas persistidas, pois hidden: aceita apenas expressão de anotação sobre campo da própria entidade.</w:t>
       </w:r>
     </w:p>
     <w:p>
@@ -29228,7 +30026,7 @@
                 <w:szCs w:val="22"/>
                 <w:lang w:val="en-US" w:eastAsia="en-US" w:bidi="ar-SA"/>
               </w:rPr>
-              <w:t xml:space="preserve">Endereços</w:t>
+              <w:t>Endereços</w:t>
             </w:r>
           </w:p>
         </w:tc>
@@ -29261,7 +30059,7 @@
                 <w:szCs w:val="22"/>
                 <w:lang w:val="en-US" w:eastAsia="en-US" w:bidi="ar-SA"/>
               </w:rPr>
-              <w:t xml:space="preserve">Determination PreencherEnderecoViaCep</w:t>
+              <w:t>Feature control do campo Cep (field ( features : instance ) Cep)</w:t>
             </w:r>
           </w:p>
         </w:tc>
@@ -29294,7 +30092,7 @@
                 <w:szCs w:val="22"/>
                 <w:lang w:val="en-US" w:eastAsia="en-US" w:bidi="ar-SA"/>
               </w:rPr>
-              <w:t xml:space="preserve">Preenche logradouro, bairro, cidade, UF e estado a partir do CEP.</w:t>
+              <w:t>CEP obrigatório no cadastro e somente leitura depois que o endereço é gravado (faz parte da chave da tabela).</w:t>
             </w:r>
           </w:p>
         </w:tc>
@@ -29330,7 +30128,7 @@
                 <w:szCs w:val="22"/>
                 <w:lang w:val="en-US" w:eastAsia="en-US" w:bidi="ar-SA"/>
               </w:rPr>
-              <w:t>Estoque</w:t>
+              <w:t xml:space="preserve">Endereços</w:t>
             </w:r>
           </w:p>
         </w:tc>
@@ -29363,7 +30161,7 @@
                 <w:szCs w:val="22"/>
                 <w:lang w:val="en-US" w:eastAsia="en-US" w:bidi="ar-SA"/>
               </w:rPr>
-              <w:t>Determination GerarSku</w:t>
+              <w:t xml:space="preserve">Determination PreencherEnderecoViaCep</w:t>
             </w:r>
           </w:p>
         </w:tc>
@@ -29396,7 +30194,7 @@
                 <w:szCs w:val="22"/>
                 <w:lang w:val="en-US" w:eastAsia="en-US" w:bidi="ar-SA"/>
               </w:rPr>
-              <w:t>Gera o SKU único no Save do rascunho (on save, também no Prepare), com as 3 primeiras letras da categoria; regenera se a categoria mudar.</w:t>
+              <w:t xml:space="preserve">Preenche logradouro, bairro, cidade, UF e estado a partir do CEP.</w:t>
             </w:r>
           </w:p>
         </w:tc>
@@ -29465,7 +30263,7 @@
                 <w:szCs w:val="22"/>
                 <w:lang w:val="en-US" w:eastAsia="en-US" w:bidi="ar-SA"/>
               </w:rPr>
-              <w:t>Determination RecalcularStatusEstoque</w:t>
+              <w:t>Determination GerarSku</w:t>
             </w:r>
           </w:p>
         </w:tc>
@@ -29498,7 +30296,7 @@
                 <w:szCs w:val="22"/>
                 <w:lang w:val="en-US" w:eastAsia="en-US" w:bidi="ar-SA"/>
               </w:rPr>
-              <w:t>Recalcula status conforme disponibilidade.</w:t>
+              <w:t>Gera o SKU único no Save do rascunho (on save, também no Prepare), com as 3 primeiras letras da categoria; regenera se a categoria mudar.</w:t>
             </w:r>
           </w:p>
         </w:tc>
@@ -29567,7 +30365,7 @@
                 <w:szCs w:val="22"/>
                 <w:lang w:val="en-US" w:eastAsia="en-US" w:bidi="ar-SA"/>
               </w:rPr>
-              <w:t>Validation ValidarInativacaoItem</w:t>
+              <w:t>Determination RecalcularStatusEstoque</w:t>
             </w:r>
           </w:p>
         </w:tc>
@@ -29600,7 +30398,7 @@
                 <w:szCs w:val="22"/>
                 <w:lang w:val="en-US" w:eastAsia="en-US" w:bidi="ar-SA"/>
               </w:rPr>
-              <w:t>Bloqueia inativação indevida.</w:t>
+              <w:t>Recalcula status conforme disponibilidade.</w:t>
             </w:r>
           </w:p>
         </w:tc>
@@ -29636,7 +30434,7 @@
                 <w:szCs w:val="22"/>
                 <w:lang w:val="en-US" w:eastAsia="en-US" w:bidi="ar-SA"/>
               </w:rPr>
-              <w:t xml:space="preserve">Estoque</w:t>
+              <w:t>Estoque</w:t>
             </w:r>
           </w:p>
         </w:tc>
@@ -29669,7 +30467,7 @@
                 <w:szCs w:val="22"/>
                 <w:lang w:val="en-US" w:eastAsia="en-US" w:bidi="ar-SA"/>
               </w:rPr>
-              <w:t xml:space="preserve">Actions internas ReservarEstoque / LiberarReserva / BaixarEstoque</w:t>
+              <w:t>Validation ValidarInativacaoItem</w:t>
             </w:r>
           </w:p>
         </w:tc>
@@ -29702,7 +30500,7 @@
                 <w:szCs w:val="22"/>
                 <w:lang w:val="en-US" w:eastAsia="en-US" w:bidi="ar-SA"/>
               </w:rPr>
-              <w:t xml:space="preserve">Movimentam QtdeReservada/QtdeEstoque sob lock; chamadas somente pelo BO Pedido.</w:t>
+              <w:t>Bloqueia inativação indevida.</w:t>
             </w:r>
           </w:p>
         </w:tc>
@@ -29738,7 +30536,7 @@
                 <w:szCs w:val="22"/>
                 <w:lang w:val="en-US" w:eastAsia="en-US" w:bidi="ar-SA"/>
               </w:rPr>
-              <w:t>Pedidos</w:t>
+              <w:t xml:space="preserve">Estoque</w:t>
             </w:r>
           </w:p>
         </w:tc>
@@ -29771,7 +30569,7 @@
                 <w:szCs w:val="22"/>
                 <w:lang w:val="en-US" w:eastAsia="en-US" w:bidi="ar-SA"/>
               </w:rPr>
-              <w:t>Determination ReservarEstoqueRegistro + Validation ValidarRegistro</w:t>
+              <w:t xml:space="preserve">Actions internas ReservarEstoque / LiberarReserva / BaixarEstoque</w:t>
             </w:r>
           </w:p>
         </w:tc>
@@ -29804,7 +30602,7 @@
                 <w:szCs w:val="22"/>
                 <w:lang w:val="en-US" w:eastAsia="en-US" w:bidi="ar-SA"/>
               </w:rPr>
-              <w:t>No Save do rascunho: ValidarRegistro checa endereço principal, itens e disponibilidade; ao ativar, a determination reserva o estoque, fixa preços e total.</w:t>
+              <w:t xml:space="preserve">Movimentam QtdeReservada/QtdeEstoque sob lock; chamadas somente pelo BO Pedido.</w:t>
             </w:r>
           </w:p>
         </w:tc>
@@ -29873,7 +30671,7 @@
                 <w:szCs w:val="22"/>
                 <w:lang w:val="en-US" w:eastAsia="en-US" w:bidi="ar-SA"/>
               </w:rPr>
-              <w:t>Action SimularPagamento</w:t>
+              <w:t>Determination ReservarEstoqueRegistro + Validation ValidarRegistro</w:t>
             </w:r>
           </w:p>
         </w:tc>
@@ -29906,7 +30704,7 @@
                 <w:szCs w:val="22"/>
                 <w:lang w:val="en-US" w:eastAsia="en-US" w:bidi="ar-SA"/>
               </w:rPr>
-              <w:t>Processa pagamento fictício sem persistir dados sensíveis.</w:t>
+              <w:t>No Save do rascunho: ValidarRegistro checa endereço principal, itens e disponibilidade; ao ativar (e ao salvar a edição de itens), a determination reserva só a diferença de estoque, fixa preços e total.</w:t>
             </w:r>
           </w:p>
         </w:tc>
@@ -29975,7 +30773,7 @@
                 <w:szCs w:val="22"/>
                 <w:lang w:val="en-US" w:eastAsia="en-US" w:bidi="ar-SA"/>
               </w:rPr>
-              <w:t>Action AprovarPedido</w:t>
+              <w:t>Action SimularPagamento (Efetuar Pagamento)</w:t>
             </w:r>
           </w:p>
         </w:tc>
@@ -30008,7 +30806,7 @@
                 <w:szCs w:val="22"/>
                 <w:lang w:val="en-US" w:eastAsia="en-US" w:bidi="ar-SA"/>
               </w:rPr>
-              <w:t>Valida pagamento, baixa estoque, gera snapshot e finaliza.</w:t>
+              <w:t>Processa pagamento fictício sem persistir dados sensíveis.</w:t>
             </w:r>
           </w:p>
         </w:tc>
@@ -30077,7 +30875,7 @@
                 <w:szCs w:val="22"/>
                 <w:lang w:val="en-US" w:eastAsia="en-US" w:bidi="ar-SA"/>
               </w:rPr>
-              <w:t>Action CancelarPedido</w:t>
+              <w:t>Action AprovarPedido (Aprovar pedido)</w:t>
             </w:r>
           </w:p>
         </w:tc>
@@ -30110,7 +30908,7 @@
                 <w:szCs w:val="22"/>
                 <w:lang w:val="en-US" w:eastAsia="en-US" w:bidi="ar-SA"/>
               </w:rPr>
-              <w:t>Cancela o pedido, libera a reserva, registra o motivo e gera snapshot; com pagamento aprovado abre a solicitação de reembolso (PROCESSAR_REEMBOLSO).</w:t>
+              <w:t>Valida pagamento, baixa estoque, gera snapshot e finaliza.</w:t>
             </w:r>
           </w:p>
         </w:tc>
@@ -30179,7 +30977,7 @@
                 <w:szCs w:val="22"/>
                 <w:lang w:val="en-US" w:eastAsia="en-US" w:bidi="ar-SA"/>
               </w:rPr>
-              <w:t>Actions internas CancelarPorReembolso / RetomarPedido</w:t>
+              <w:t>Action CancelarPedido</w:t>
             </w:r>
           </w:p>
         </w:tc>
@@ -30212,7 +31010,7 @@
                 <w:szCs w:val="22"/>
                 <w:lang w:val="en-US" w:eastAsia="en-US" w:bidi="ar-SA"/>
               </w:rPr>
-              <w:t>Chamadas pelo BO Reembolso (authorization : none): cancelar com liberação de reserva e snapshots, ou retomar o status anterior.</w:t>
+              <w:t>Cancela o pedido, libera a reserva, registra o motivo e gera snapshot; com pagamento aprovado abre a solicitação de reembolso (PROCESSANDO_REEMBOLSO).</w:t>
             </w:r>
           </w:p>
         </w:tc>
@@ -30281,6 +31079,108 @@
                 <w:szCs w:val="22"/>
                 <w:lang w:val="en-US" w:eastAsia="en-US" w:bidi="ar-SA"/>
               </w:rPr>
+              <w:t>Actions internas CancelarPorReembolso / RetomarPedido</w:t>
+            </w:r>
+          </w:p>
+        </w:tc>
+        <w:tc>
+          <w:tcPr>
+            <w:tcW w:w="3309" w:type="dxa"/>
+            <w:tcBorders/>
+            <w:vAlign w:val="center"/>
+          </w:tcPr>
+          <w:p>
+            <w:pPr>
+              <w:pStyle w:val="Normal"/>
+              <w:widowControl/>
+              <w:suppressAutoHyphens w:val="true"/>
+              <w:spacing w:lineRule="auto" w:line="240" w:before="0" w:after="0"/>
+              <w:jc w:val="left"/>
+              <w:rPr>
+                <w:rFonts w:cs=""/>
+                <w:kern w:val="0"/>
+                <w:szCs w:val="22"/>
+                <w:lang w:val="en-US" w:eastAsia="en-US" w:bidi="ar-SA"/>
+              </w:rPr>
+            </w:pPr>
+            <w:r>
+              <w:rPr>
+                <w:rFonts w:cs=""/>
+                <w:b/>
+                <w:kern w:val="0"/>
+                <w:sz w:val="17"/>
+                <w:szCs w:val="22"/>
+                <w:lang w:val="en-US" w:eastAsia="en-US" w:bidi="ar-SA"/>
+              </w:rPr>
+              <w:t>Chamadas pelo BO Reembolso (authorization : none): cancelar com liberação de reserva e snapshots, ou retomar o status anterior.</w:t>
+            </w:r>
+          </w:p>
+        </w:tc>
+      </w:tr>
+      <w:tr>
+        <w:trPr/>
+        <w:tc>
+          <w:tcPr>
+            <w:tcW w:w="3308" w:type="dxa"/>
+            <w:tcBorders/>
+            <w:vAlign w:val="center"/>
+          </w:tcPr>
+          <w:p>
+            <w:pPr>
+              <w:pStyle w:val="Normal"/>
+              <w:widowControl/>
+              <w:suppressAutoHyphens w:val="true"/>
+              <w:spacing w:lineRule="auto" w:line="240" w:before="0" w:after="0"/>
+              <w:jc w:val="left"/>
+              <w:rPr>
+                <w:rFonts w:cs=""/>
+                <w:kern w:val="0"/>
+                <w:szCs w:val="22"/>
+                <w:lang w:val="en-US" w:eastAsia="en-US" w:bidi="ar-SA"/>
+              </w:rPr>
+            </w:pPr>
+            <w:r>
+              <w:rPr>
+                <w:rFonts w:cs=""/>
+                <w:b/>
+                <w:kern w:val="0"/>
+                <w:sz w:val="17"/>
+                <w:szCs w:val="22"/>
+                <w:lang w:val="en-US" w:eastAsia="en-US" w:bidi="ar-SA"/>
+              </w:rPr>
+              <w:t>Pedidos</w:t>
+            </w:r>
+          </w:p>
+        </w:tc>
+        <w:tc>
+          <w:tcPr>
+            <w:tcW w:w="3309" w:type="dxa"/>
+            <w:tcBorders/>
+            <w:vAlign w:val="center"/>
+          </w:tcPr>
+          <w:p>
+            <w:pPr>
+              <w:pStyle w:val="Normal"/>
+              <w:widowControl/>
+              <w:suppressAutoHyphens w:val="true"/>
+              <w:spacing w:lineRule="auto" w:line="240" w:before="0" w:after="0"/>
+              <w:jc w:val="left"/>
+              <w:rPr>
+                <w:rFonts w:cs=""/>
+                <w:kern w:val="0"/>
+                <w:szCs w:val="22"/>
+                <w:lang w:val="en-US" w:eastAsia="en-US" w:bidi="ar-SA"/>
+              </w:rPr>
+            </w:pPr>
+            <w:r>
+              <w:rPr>
+                <w:rFonts w:cs=""/>
+                <w:b/>
+                <w:kern w:val="0"/>
+                <w:sz w:val="17"/>
+                <w:szCs w:val="22"/>
+                <w:lang w:val="en-US" w:eastAsia="en-US" w:bidi="ar-SA"/>
+              </w:rPr>
               <w:t>Determination DefinirStatusInicial</w:t>
             </w:r>
           </w:p>
@@ -30314,7 +31214,211 @@
                 <w:szCs w:val="22"/>
                 <w:lang w:val="en-US" w:eastAsia="en-US" w:bidi="ar-SA"/>
               </w:rPr>
-              <w:t xml:space="preserve">Define CRIADO/PENDENTE/BRL na criação (on modify, já no draft).</w:t>
+              <w:t>Define ABERTO/PENDENTE/BRL na criação (on modify, já no draft).</w:t>
+            </w:r>
+          </w:p>
+        </w:tc>
+      </w:tr>
+      <w:tr>
+        <w:trPr/>
+        <w:tc>
+          <w:tcPr>
+            <w:tcW w:w="3308" w:type="dxa"/>
+            <w:tcBorders/>
+            <w:vAlign w:val="center"/>
+          </w:tcPr>
+          <w:p>
+            <w:pPr>
+              <w:pStyle w:val="Normal"/>
+              <w:widowControl/>
+              <w:suppressAutoHyphens w:val="true"/>
+              <w:spacing w:lineRule="auto" w:line="240" w:before="0" w:after="0"/>
+              <w:jc w:val="left"/>
+              <w:rPr>
+                <w:rFonts w:cs=""/>
+                <w:kern w:val="0"/>
+                <w:szCs w:val="22"/>
+                <w:lang w:val="en-US" w:eastAsia="en-US" w:bidi="ar-SA"/>
+              </w:rPr>
+            </w:pPr>
+            <w:r>
+              <w:rPr>
+                <w:rFonts w:cs=""/>
+                <w:b/>
+                <w:kern w:val="0"/>
+                <w:sz w:val="17"/>
+                <w:szCs w:val="22"/>
+                <w:lang w:val="en-US" w:eastAsia="en-US" w:bidi="ar-SA"/>
+              </w:rPr>
+              <w:t>Pedidos</w:t>
+            </w:r>
+          </w:p>
+        </w:tc>
+        <w:tc>
+          <w:tcPr>
+            <w:tcW w:w="3309" w:type="dxa"/>
+            <w:tcBorders/>
+            <w:vAlign w:val="center"/>
+          </w:tcPr>
+          <w:p>
+            <w:pPr>
+              <w:pStyle w:val="Normal"/>
+              <w:widowControl/>
+              <w:suppressAutoHyphens w:val="true"/>
+              <w:spacing w:lineRule="auto" w:line="240" w:before="0" w:after="0"/>
+              <w:jc w:val="left"/>
+              <w:rPr>
+                <w:rFonts w:cs=""/>
+                <w:kern w:val="0"/>
+                <w:szCs w:val="22"/>
+                <w:lang w:val="en-US" w:eastAsia="en-US" w:bidi="ar-SA"/>
+              </w:rPr>
+            </w:pPr>
+            <w:r>
+              <w:rPr>
+                <w:rFonts w:cs=""/>
+                <w:b/>
+                <w:kern w:val="0"/>
+                <w:sz w:val="17"/>
+                <w:szCs w:val="22"/>
+                <w:lang w:val="en-US" w:eastAsia="en-US" w:bidi="ar-SA"/>
+              </w:rPr>
+              <w:t>Determination AtualizarFlagsStatus</w:t>
+            </w:r>
+          </w:p>
+        </w:tc>
+        <w:tc>
+          <w:tcPr>
+            <w:tcW w:w="3309" w:type="dxa"/>
+            <w:tcBorders/>
+            <w:vAlign w:val="center"/>
+          </w:tcPr>
+          <w:p>
+            <w:pPr>
+              <w:pStyle w:val="Normal"/>
+              <w:widowControl/>
+              <w:suppressAutoHyphens w:val="true"/>
+              <w:spacing w:lineRule="auto" w:line="240" w:before="0" w:after="0"/>
+              <w:jc w:val="left"/>
+              <w:rPr>
+                <w:rFonts w:cs=""/>
+                <w:kern w:val="0"/>
+                <w:szCs w:val="22"/>
+                <w:lang w:val="en-US" w:eastAsia="en-US" w:bidi="ar-SA"/>
+              </w:rPr>
+            </w:pPr>
+            <w:r>
+              <w:rPr>
+                <w:rFonts w:cs=""/>
+                <w:b/>
+                <w:kern w:val="0"/>
+                <w:sz w:val="17"/>
+                <w:szCs w:val="22"/>
+                <w:lang w:val="en-US" w:eastAsia="en-US" w:bidi="ar-SA"/>
+              </w:rPr>
+              <w:t>Mantém os indicadores de status usados para ocultar as seções Finalização/Cancelamento e escolher a origem (snapshot ou tabelas principais).</w:t>
+            </w:r>
+          </w:p>
+        </w:tc>
+      </w:tr>
+      <w:tr>
+        <w:trPr/>
+        <w:tc>
+          <w:tcPr>
+            <w:tcW w:w="3308" w:type="dxa"/>
+            <w:tcBorders/>
+            <w:vAlign w:val="center"/>
+          </w:tcPr>
+          <w:p>
+            <w:pPr>
+              <w:pStyle w:val="Normal"/>
+              <w:widowControl/>
+              <w:suppressAutoHyphens w:val="true"/>
+              <w:spacing w:lineRule="auto" w:line="240" w:before="0" w:after="0"/>
+              <w:jc w:val="left"/>
+              <w:rPr>
+                <w:rFonts w:cs=""/>
+                <w:kern w:val="0"/>
+                <w:szCs w:val="22"/>
+                <w:lang w:val="en-US" w:eastAsia="en-US" w:bidi="ar-SA"/>
+              </w:rPr>
+            </w:pPr>
+            <w:r>
+              <w:rPr>
+                <w:rFonts w:cs=""/>
+                <w:b/>
+                <w:kern w:val="0"/>
+                <w:sz w:val="17"/>
+                <w:szCs w:val="22"/>
+                <w:lang w:val="en-US" w:eastAsia="en-US" w:bidi="ar-SA"/>
+              </w:rPr>
+              <w:t>Pedidos</w:t>
+            </w:r>
+          </w:p>
+        </w:tc>
+        <w:tc>
+          <w:tcPr>
+            <w:tcW w:w="3309" w:type="dxa"/>
+            <w:tcBorders/>
+            <w:vAlign w:val="center"/>
+          </w:tcPr>
+          <w:p>
+            <w:pPr>
+              <w:pStyle w:val="Normal"/>
+              <w:widowControl/>
+              <w:suppressAutoHyphens w:val="true"/>
+              <w:spacing w:lineRule="auto" w:line="240" w:before="0" w:after="0"/>
+              <w:jc w:val="left"/>
+              <w:rPr>
+                <w:rFonts w:cs=""/>
+                <w:kern w:val="0"/>
+                <w:szCs w:val="22"/>
+                <w:lang w:val="en-US" w:eastAsia="en-US" w:bidi="ar-SA"/>
+              </w:rPr>
+            </w:pPr>
+            <w:r>
+              <w:rPr>
+                <w:rFonts w:cs=""/>
+                <w:b/>
+                <w:kern w:val="0"/>
+                <w:sz w:val="17"/>
+                <w:szCs w:val="22"/>
+                <w:lang w:val="en-US" w:eastAsia="en-US" w:bidi="ar-SA"/>
+              </w:rPr>
+              <w:t>Draft action Activate with additional implementation</w:t>
+            </w:r>
+          </w:p>
+        </w:tc>
+        <w:tc>
+          <w:tcPr>
+            <w:tcW w:w="3309" w:type="dxa"/>
+            <w:tcBorders/>
+            <w:vAlign w:val="center"/>
+          </w:tcPr>
+          <w:p>
+            <w:pPr>
+              <w:pStyle w:val="Normal"/>
+              <w:widowControl/>
+              <w:suppressAutoHyphens w:val="true"/>
+              <w:spacing w:lineRule="auto" w:line="240" w:before="0" w:after="0"/>
+              <w:jc w:val="left"/>
+              <w:rPr>
+                <w:rFonts w:cs=""/>
+                <w:kern w:val="0"/>
+                <w:szCs w:val="22"/>
+                <w:lang w:val="en-US" w:eastAsia="en-US" w:bidi="ar-SA"/>
+              </w:rPr>
+            </w:pPr>
+            <w:r>
+              <w:rPr>
+                <w:rFonts w:cs=""/>
+                <w:b/>
+                <w:kern w:val="0"/>
+                <w:sz w:val="17"/>
+                <w:szCs w:val="22"/>
+                <w:lang w:val="en-US" w:eastAsia="en-US" w:bidi="ar-SA"/>
+              </w:rPr>
+              <w:t>Libera a reserva de itens removidos (remoção pura de item não dispara determination).</w:t>
             </w:r>
           </w:p>
         </w:tc>
@@ -30907,18 +32011,22 @@
         <w:br/>
         <w:t xml:space="preserve">                     DataCancelamento, CanceladoPor,</w:t>
         <w:br/>
-        <w:t xml:space="preserve">                     CreatedBy, CreatedAt, LastChangedBy, LastChangedAt,</w:t>
+        <w:t xml:space="preserve">                     CreatedBy, CreatedAt, LastChangedBy, LastChangedAt, LocalLastChangedAt;</w:t>
         <w:br/>
-        <w:t xml:space="preserve">                     LocalLastChangedAt;</w:t>
+        <w:t xml:space="preserve">  field ( readonly ) PedidoEncerrado, PedidoAtivoSemHistorico,</w:t>
         <w:br/>
-        <w:t xml:space="preserve">  field ( mandatory ) ClienteUUID;</w:t>
+        <w:t xml:space="preserve">                     PedidoNaoFinalizado, PedidoNaoCancelado;</w:t>
+        <w:br/>
+        <w:t xml:space="preserve">  field ( mandatory : create ) ClienteUUID;   // cliente escolhido na criação</w:t>
+        <w:br/>
+        <w:t xml:space="preserve">  field ( readonly : update )  ClienteUUID;   // pedido ABERTO: só os itens mudam</w:t>
         <w:br/>
         <w:br/>
-        <w:t xml:space="preserve">  action ( features : instance ) SimularPagamento</w:t>
+        <w:t xml:space="preserve">  action ( features : instance ) SimularPagamento        // rótulo: Efetuar Pagamento</w:t>
         <w:br/>
         <w:t xml:space="preserve">      parameter ZPC_A_PAGAMENTO_INPUT result [1] $self;</w:t>
         <w:br/>
-        <w:t xml:space="preserve">  action ( features : instance ) AprovarPedido result [1] $self;</w:t>
+        <w:t xml:space="preserve">  action ( features : instance ) AprovarPedido result [1] $self;   // rótulo: Aprovar pedido</w:t>
         <w:br/>
         <w:t xml:space="preserve">  action ( features : instance ) CancelarPedido</w:t>
         <w:br/>
@@ -30947,17 +32055,17 @@
         <w:br/>
         <w:t xml:space="preserve">  determination AtualizarFlagsStatus on modify { create; field StatusPedido; }</w:t>
         <w:br/>
-        <w:t xml:space="preserve">  determination ReservarEstoqueRegistro on modify { create; }  // reserva ao registrar</w:t>
+        <w:t xml:space="preserve">  determination ReservarEstoqueRegistro on modify { create; update; }  // reserva a diferença</w:t>
         <w:br/>
         <w:br/>
         <w:t xml:space="preserve">  validation ValidarCliente on save { create; field ClienteUUID; }</w:t>
         <w:br/>
-        <w:t xml:space="preserve">  validation ValidarRegistro on save { create; }  // endereço, itens, disponibilidade</w:t>
+        <w:t xml:space="preserve">  validation ValidarRegistro on save { create; update; }  // endereço, itens, disponibilidade</w:t>
         <w:br/>
         <w:br/>
-        <w:t xml:space="preserve">  draft action ( features : instance ) Edit;</w:t>
+        <w:t xml:space="preserve">  draft action ( features : instance ) Edit;     // habilitada só em pedido ABERTO</w:t>
         <w:br/>
-        <w:t xml:space="preserve">  draft action Activate;  // não otimizada: dispara ReservarEstoqueRegistro</w:t>
+        <w:t xml:space="preserve">  draft action Activate with additional implementation;  // libera reserva de itens removidos</w:t>
         <w:br/>
         <w:t xml:space="preserve">  draft action Discard;</w:t>
         <w:br/>
@@ -33867,7 +34975,7 @@
                 <w:szCs w:val="22"/>
                 <w:lang w:val="en-US" w:eastAsia="en-US" w:bidi="ar-SA"/>
               </w:rPr>
-              <w:t xml:space="preserve">Pedido só pode ser editado ou excluído no status CRIADO.</w:t>
+              <w:t>Pedido só pode ser editado ou excluído no status ABERTO.</w:t>
             </w:r>
           </w:p>
         </w:tc>
@@ -34606,6 +35714,20 @@
     </w:p>
     <w:p>
       <w:pPr>
+        <w:pStyle w:val="ListBullet"/>
+        <w:numPr>
+          <w:ilvl w:val="0"/>
+          <w:numId w:val="1"/>
+        </w:numPr>
+        <w:rPr/>
+      </w:pPr>
+      <w:r>
+        <w:rPr/>
+        <w:t>Dado um endereço já gravado, quando o usuário tentar alterar o CEP, então o campo deve estar somente leitura (para trocar o CEP, excluir o endereço e cadastrar outro).</w:t>
+      </w:r>
+    </w:p>
+    <w:p>
+      <w:pPr>
         <w:pStyle w:val="Heading2"/>
         <w:rPr/>
       </w:pPr>
@@ -34733,7 +35855,7 @@
       </w:pPr>
       <w:r>
         <w:rPr/>
-        <w:t>Dado um rascunho com cliente ativo, endereço principal e itens com estoque disponível, quando o usuário salvar, então o pedido deve ser registrado como CRIADO e o estoque dos itens reservado.</w:t>
+        <w:t>Dado um rascunho com cliente ativo, endereço principal e itens com estoque disponível, quando o usuário salvar, então o pedido deve ser registrado como ABERTO e o estoque dos itens reservado.</w:t>
       </w:r>
     </w:p>
     <w:p>
@@ -34761,7 +35883,7 @@
       </w:pPr>
       <w:r>
         <w:rPr/>
-        <w:t>Dado um pedido registrado (CRIADO), então ele não oferece Editar nem Excluir; só Simular pagamento e Cancelar.</w:t>
+        <w:t>Dado um pedido registrado (ABERTO), então ele oferece Editar (somente itens), Efetuar Pagamento e Cancelar, mas não Excluir; o cliente é somente leitura.</w:t>
       </w:r>
     </w:p>
     <w:p>
@@ -34775,7 +35897,35 @@
       </w:pPr>
       <w:r>
         <w:rPr/>
-        <w:t>Dado um pedido em CRIADO ou AGUARDANDO_PAGAMENTO, quando o pagamento simulado for aprovado, então StatusPagamento deve ser APROVADO e StatusPedido deve ser AGUARDANDO_APROVACAO.</w:t>
+        <w:t>Dado um pedido ABERTO, quando o usuário editar a quantidade de um item, incluir ou remover um item e salvar, então a reserva de estoque deve refletir apenas a diferença (e a remoção de um item libera a sua reserva).</w:t>
+      </w:r>
+    </w:p>
+    <w:p>
+      <w:pPr>
+        <w:pStyle w:val="ListBullet"/>
+        <w:numPr>
+          <w:ilvl w:val="0"/>
+          <w:numId w:val="1"/>
+        </w:numPr>
+        <w:rPr/>
+      </w:pPr>
+      <w:r>
+        <w:rPr/>
+        <w:t>Dado um pedido FINALIZADO ou CANCELADO, quando abrir a Object Page, então deve ver as seções Dados do Cliente, Dados do Pedido, Itens, Pagamento e Finalização (ou Cancelamento), com cliente e itens lidos dos snapshots; nos demais status as seções Finalização e Cancelamento não aparecem e os dados vêm das tabelas principais.</w:t>
+      </w:r>
+    </w:p>
+    <w:p>
+      <w:pPr>
+        <w:pStyle w:val="ListBullet"/>
+        <w:numPr>
+          <w:ilvl w:val="0"/>
+          <w:numId w:val="1"/>
+        </w:numPr>
+        <w:rPr/>
+      </w:pPr>
+      <w:r>
+        <w:rPr/>
+        <w:t>Dado um pedido ABERTO, quando o pagamento simulado (Efetuar Pagamento) for aprovado, então StatusPagamento deve ser APROVADO e StatusPedido deve ser AGUARDANDO_APROVACAO; se for recusado, o pedido continua ABERTO e uma nova tentativa é permitida.</w:t>
       </w:r>
     </w:p>
     <w:p>
@@ -34831,7 +35981,7 @@
       </w:pPr>
       <w:r>
         <w:rPr/>
-        <w:t>Dado um pedido com pagamento aprovado, quando executar CancelarPedido com motivo, então o sistema deve criar uma solicitação de reembolso PENDENTE e alterar o status para PROCESSAR_REEMBOLSO, mantendo a reserva.</w:t>
+        <w:t>Dado um pedido com pagamento aprovado, quando executar CancelarPedido com motivo, então o sistema deve criar uma solicitação de reembolso PENDENTE e alterar o status para PROCESSANDO_REEMBOLSO, mantendo a reserva.</w:t>
       </w:r>
     </w:p>
     <w:p>
@@ -34869,7 +36019,7 @@
       </w:pPr>
       <w:r>
         <w:rPr/>
-        <w:t>Dada uma solicitação PENDENTE, quando o usuário executar Aprovar reembolso na aplicação Gestão de Reembolsos, então o reembolso deve ficar APROVADO, a reserva ser liberada, os snapshots gerados e o pedido CANCELADO.</w:t>
+        <w:t>Dada uma solicitação PENDENTE, quando o usuário executar Aprovar reembolso na aplicação Gestão de Reembolsos, então o reembolso deve ficar APROVADO, a reserva ser liberada, os snapshots gerados, o pedido CANCELADO e o pagamento DEVOLVIDO.</w:t>
       </w:r>
     </w:p>
     <w:p>
@@ -35160,7 +36310,7 @@
       </w:pPr>
       <w:r>
         <w:rPr/>
-        <w:t>Execução da classe ZCL_PC_SETUP (F9) para criar os intervalos de numeração 01 (pedido) e 02 (SKU), carregar as CodeLists e os dados de demonstração. É pré-requisito para salvar o primeiro pedido ou item: sem os intervalos o Save falha com "Erro ao obter numeração".</w:t>
+        <w:t>Execução da classe ZCL_PC_SETUP (F9) para criar os intervalos de numeração 01 (pedido) e 02 (SKU), carregar as CodeLists e os dados de demonstração. É pré-requisito para salvar o primeiro pedido ou item: sem os intervalos o Save falha com "Erro ao obter numeração". Também migra pedidos do modelo antigo de status (CRIADO/AGUARDANDO_PAGAMENTO/PROCESSANDO_REEMBOLSO) para o atual e recalcula os indicadores de status.</w:t>
       </w:r>
     </w:p>
     <w:p>
@@ -35174,7 +36324,7 @@
       </w:pPr>
       <w:r>
         <w:rPr/>
-        <w:t>Publicação de quatro Service Bindings OData V4 UI independentes (ZUI_PC_CLIENTES_O4, ZUI_PC_ESTOQUE_O4, ZUI_PC_PEDIDOS_COMPRAS_O4 e ZUI_PC_REEMBOLSOS_O4); o ADT só cria bindings V4 manualmente.</w:t>
+        <w:t>Publicação de quatro Service Bindings OData V4 UI independentes (ZUI_PC_CLIENTES_O4, ZUI_PC_ESTOQUE_O4, ZUI_PC_PEDIDOS_COMPRAS_O4 e ZUI_PC_REEMBOLSOS_O4); o ADT só cria bindings V4 manualmente; a camada analítica usa o binding ZUI_PC_ANALITICO_O4 (serviço ZUI_PC_ANALITICO).</w:t>
       </w:r>
     </w:p>
     <w:p>
@@ -35189,6 +36339,20 @@
       <w:r>
         <w:rPr/>
         <w:t>Quatro aplicações Fiori Elements List Report/Object Page (pasta ui5/), publicadas no ABAP Repository com npm run deploy em cada app (BSP ZPC_CLIENTES, ZPC_ESTOQUE, ZPC_PEDIDOS e ZPC_REEMBOLSOS).</w:t>
+      </w:r>
+    </w:p>
+    <w:p>
+      <w:pPr>
+        <w:pStyle w:val="ListBullet"/>
+        <w:numPr>
+          <w:ilvl w:val="0"/>
+          <w:numId w:val="1"/>
+        </w:numPr>
+        <w:rPr/>
+      </w:pPr>
+      <w:r>
+        <w:rPr/>
+        <w:t>Camada analítica: 20 aplicações ALP (ui5/analise-*) e o Painel de Compras (ui5/painel-compras, Overview Page), publicados como BSPs ZPC_ANL_* e ZPC_PAINEL.</w:t>
       </w:r>
     </w:p>
     <w:p>
@@ -40683,6 +41847,1636 @@
         </w:tc>
       </w:tr>
     </w:tbl>
+    <w:p>
+      <w:pPr>
+        <w:pStyle w:val="Normal"/>
+        <w:widowControl/>
+        <w:bidi w:val="0"/>
+        <w:spacing w:lineRule="auto" w:line="276" w:before="0" w:after="200"/>
+        <w:jc w:val="left"/>
+        <w:rPr/>
+      </w:pPr>
+      <w:r>
+        <w:rPr/>
+        <w:t>Versão 2.2 — novo modelo de status do pedido, edição dos itens do pedido aberto, Object Page dinâmica, correção do dump ao alterar o CEP, camada analítica e suíte permanente de testes.</w:t>
+      </w:r>
+    </w:p>
+    <w:tbl>
+      <w:tblPr>
+        <w:tblStyle w:val="Tabelacomgrade"/>
+        <w:tblW w:w="9926" w:type="dxa"/>
+        <w:jc w:val="center"/>
+        <w:tblInd w:w="0" w:type="dxa"/>
+        <w:tblLayout w:type="fixed"/>
+        <w:tblCellMar>
+          <w:top w:w="0" w:type="dxa"/>
+          <w:left w:w="108" w:type="dxa"/>
+          <w:bottom w:w="0" w:type="dxa"/>
+          <w:right w:w="108" w:type="dxa"/>
+        </w:tblCellMar>
+        <w:tblLook w:val="04a0" w:noHBand="0" w:noVBand="1" w:firstColumn="1" w:lastRow="0" w:lastColumn="0" w:firstRow="1"/>
+      </w:tblPr>
+      <w:tblGrid>
+        <w:gridCol w:w="520"/>
+        <w:gridCol w:w="1400"/>
+        <w:gridCol w:w="4000"/>
+        <w:gridCol w:w="4006"/>
+      </w:tblGrid>
+      <w:tr>
+        <w:trPr/>
+        <w:tc>
+          <w:tcPr>
+            <w:tcW w:w="520" w:type="dxa"/>
+            <w:tcBorders/>
+            <w:shd w:color="auto" w:fill="0070F2" w:val="clear"/>
+            <w:vAlign w:val="center"/>
+          </w:tcPr>
+          <w:p>
+            <w:pPr>
+              <w:pStyle w:val="Normal"/>
+              <w:widowControl/>
+              <w:suppressAutoHyphens w:val="true"/>
+              <w:spacing w:lineRule="auto" w:line="240" w:before="0" w:after="0"/>
+              <w:jc w:val="left"/>
+              <w:rPr>
+                <w:rFonts w:cs=""/>
+                <w:kern w:val="0"/>
+                <w:szCs w:val="22"/>
+                <w:lang w:val="en-US" w:eastAsia="en-US" w:bidi="ar-SA"/>
+              </w:rPr>
+            </w:pPr>
+            <w:r>
+              <w:rPr>
+                <w:rFonts w:cs=""/>
+                <w:b/>
+                <w:color w:val="FFFFFF"/>
+                <w:kern w:val="0"/>
+                <w:sz w:val="18"/>
+                <w:szCs w:val="22"/>
+                <w:lang w:val="en-US" w:eastAsia="en-US" w:bidi="ar-SA"/>
+              </w:rPr>
+              <w:t>#</w:t>
+            </w:r>
+          </w:p>
+        </w:tc>
+        <w:tc>
+          <w:tcPr>
+            <w:tcW w:w="1400" w:type="dxa"/>
+            <w:tcBorders/>
+            <w:shd w:color="auto" w:fill="0070F2" w:val="clear"/>
+            <w:vAlign w:val="center"/>
+          </w:tcPr>
+          <w:p>
+            <w:pPr>
+              <w:pStyle w:val="Normal"/>
+              <w:widowControl/>
+              <w:suppressAutoHyphens w:val="true"/>
+              <w:spacing w:lineRule="auto" w:line="240" w:before="0" w:after="0"/>
+              <w:jc w:val="left"/>
+              <w:rPr>
+                <w:rFonts w:cs=""/>
+                <w:kern w:val="0"/>
+                <w:szCs w:val="22"/>
+                <w:lang w:val="en-US" w:eastAsia="en-US" w:bidi="ar-SA"/>
+              </w:rPr>
+            </w:pPr>
+            <w:r>
+              <w:rPr>
+                <w:rFonts w:cs=""/>
+                <w:b/>
+                <w:color w:val="FFFFFF"/>
+                <w:kern w:val="0"/>
+                <w:sz w:val="18"/>
+                <w:szCs w:val="22"/>
+                <w:lang w:val="en-US" w:eastAsia="en-US" w:bidi="ar-SA"/>
+              </w:rPr>
+              <w:t>Seção</w:t>
+            </w:r>
+          </w:p>
+        </w:tc>
+        <w:tc>
+          <w:tcPr>
+            <w:tcW w:w="4000" w:type="dxa"/>
+            <w:tcBorders/>
+            <w:shd w:color="auto" w:fill="0070F2" w:val="clear"/>
+            <w:vAlign w:val="center"/>
+          </w:tcPr>
+          <w:p>
+            <w:pPr>
+              <w:pStyle w:val="Normal"/>
+              <w:widowControl/>
+              <w:suppressAutoHyphens w:val="true"/>
+              <w:spacing w:lineRule="auto" w:line="240" w:before="0" w:after="0"/>
+              <w:jc w:val="left"/>
+              <w:rPr>
+                <w:rFonts w:cs=""/>
+                <w:kern w:val="0"/>
+                <w:szCs w:val="22"/>
+                <w:lang w:val="en-US" w:eastAsia="en-US" w:bidi="ar-SA"/>
+              </w:rPr>
+            </w:pPr>
+            <w:r>
+              <w:rPr>
+                <w:rFonts w:cs=""/>
+                <w:b/>
+                <w:color w:val="FFFFFF"/>
+                <w:kern w:val="0"/>
+                <w:sz w:val="18"/>
+                <w:szCs w:val="22"/>
+                <w:lang w:val="en-US" w:eastAsia="en-US" w:bidi="ar-SA"/>
+              </w:rPr>
+              <w:t>Situação na versão 2.1</w:t>
+            </w:r>
+          </w:p>
+        </w:tc>
+        <w:tc>
+          <w:tcPr>
+            <w:tcW w:w="4006" w:type="dxa"/>
+            <w:tcBorders/>
+            <w:shd w:color="auto" w:fill="0070F2" w:val="clear"/>
+            <w:vAlign w:val="center"/>
+          </w:tcPr>
+          <w:p>
+            <w:pPr>
+              <w:pStyle w:val="Normal"/>
+              <w:widowControl/>
+              <w:suppressAutoHyphens w:val="true"/>
+              <w:spacing w:lineRule="auto" w:line="240" w:before="0" w:after="0"/>
+              <w:jc w:val="left"/>
+              <w:rPr>
+                <w:rFonts w:cs=""/>
+                <w:kern w:val="0"/>
+                <w:szCs w:val="22"/>
+                <w:lang w:val="en-US" w:eastAsia="en-US" w:bidi="ar-SA"/>
+              </w:rPr>
+            </w:pPr>
+            <w:r>
+              <w:rPr>
+                <w:rFonts w:cs=""/>
+                <w:b/>
+                <w:color w:val="FFFFFF"/>
+                <w:kern w:val="0"/>
+                <w:sz w:val="18"/>
+                <w:szCs w:val="22"/>
+                <w:lang w:val="en-US" w:eastAsia="en-US" w:bidi="ar-SA"/>
+              </w:rPr>
+              <w:t>Alteração na versão 2.2</w:t>
+            </w:r>
+          </w:p>
+        </w:tc>
+      </w:tr>
+      <w:tr>
+        <w:trPr/>
+        <w:tc>
+          <w:tcPr>
+            <w:tcW w:w="520" w:type="dxa"/>
+            <w:tcBorders/>
+            <w:vAlign w:val="center"/>
+          </w:tcPr>
+          <w:p>
+            <w:pPr>
+              <w:pStyle w:val="Normal"/>
+              <w:widowControl/>
+              <w:suppressAutoHyphens w:val="true"/>
+              <w:spacing w:lineRule="auto" w:line="240" w:before="0" w:after="0"/>
+              <w:jc w:val="left"/>
+              <w:rPr>
+                <w:rFonts w:cs=""/>
+                <w:kern w:val="0"/>
+                <w:szCs w:val="22"/>
+                <w:lang w:val="en-US" w:eastAsia="en-US" w:bidi="ar-SA"/>
+              </w:rPr>
+            </w:pPr>
+            <w:r>
+              <w:rPr>
+                <w:rFonts w:cs=""/>
+                <w:b/>
+                <w:kern w:val="0"/>
+                <w:sz w:val="17"/>
+                <w:szCs w:val="22"/>
+                <w:lang w:val="en-US" w:eastAsia="en-US" w:bidi="ar-SA"/>
+              </w:rPr>
+              <w:t>1</w:t>
+            </w:r>
+          </w:p>
+        </w:tc>
+        <w:tc>
+          <w:tcPr>
+            <w:tcW w:w="1400" w:type="dxa"/>
+            <w:tcBorders/>
+            <w:vAlign w:val="center"/>
+          </w:tcPr>
+          <w:p>
+            <w:pPr>
+              <w:pStyle w:val="Normal"/>
+              <w:widowControl/>
+              <w:suppressAutoHyphens w:val="true"/>
+              <w:spacing w:lineRule="auto" w:line="240" w:before="0" w:after="0"/>
+              <w:jc w:val="left"/>
+              <w:rPr>
+                <w:rFonts w:cs=""/>
+                <w:kern w:val="0"/>
+                <w:szCs w:val="22"/>
+                <w:lang w:val="en-US" w:eastAsia="en-US" w:bidi="ar-SA"/>
+              </w:rPr>
+            </w:pPr>
+            <w:r>
+              <w:rPr>
+                <w:rFonts w:cs=""/>
+                <w:b/>
+                <w:kern w:val="0"/>
+                <w:sz w:val="17"/>
+                <w:szCs w:val="22"/>
+                <w:lang w:val="en-US" w:eastAsia="en-US" w:bidi="ar-SA"/>
+              </w:rPr>
+              <w:t>2.1, 8.3, 10.4, 11, 16, 18.3</w:t>
+            </w:r>
+          </w:p>
+        </w:tc>
+        <w:tc>
+          <w:tcPr>
+            <w:tcW w:w="4000" w:type="dxa"/>
+            <w:tcBorders/>
+            <w:vAlign w:val="center"/>
+          </w:tcPr>
+          <w:p>
+            <w:pPr>
+              <w:pStyle w:val="Normal"/>
+              <w:widowControl/>
+              <w:suppressAutoHyphens w:val="true"/>
+              <w:spacing w:lineRule="auto" w:line="240" w:before="0" w:after="0"/>
+              <w:jc w:val="left"/>
+              <w:rPr>
+                <w:rFonts w:cs=""/>
+                <w:kern w:val="0"/>
+                <w:szCs w:val="22"/>
+                <w:lang w:val="en-US" w:eastAsia="en-US" w:bidi="ar-SA"/>
+              </w:rPr>
+            </w:pPr>
+            <w:r>
+              <w:rPr>
+                <w:rFonts w:cs=""/>
+                <w:b/>
+                <w:kern w:val="0"/>
+                <w:sz w:val="17"/>
+                <w:szCs w:val="22"/>
+                <w:lang w:val="en-US" w:eastAsia="en-US" w:bidi="ar-SA"/>
+              </w:rPr>
+              <w:t>Status CRIADO, AGUARDANDO_PAGAMENTO, AGUARDANDO_APROVACAO, FINALIZADO, PROCESSAR_REEMBOLSO e CANCELADO.</w:t>
+            </w:r>
+          </w:p>
+        </w:tc>
+        <w:tc>
+          <w:tcPr>
+            <w:tcW w:w="4006" w:type="dxa"/>
+            <w:tcBorders/>
+            <w:vAlign w:val="center"/>
+          </w:tcPr>
+          <w:p>
+            <w:pPr>
+              <w:pStyle w:val="Normal"/>
+              <w:widowControl/>
+              <w:suppressAutoHyphens w:val="true"/>
+              <w:spacing w:lineRule="auto" w:line="240" w:before="0" w:after="0"/>
+              <w:jc w:val="left"/>
+              <w:rPr>
+                <w:rFonts w:cs=""/>
+                <w:kern w:val="0"/>
+                <w:szCs w:val="22"/>
+                <w:lang w:val="en-US" w:eastAsia="en-US" w:bidi="ar-SA"/>
+              </w:rPr>
+            </w:pPr>
+            <w:r>
+              <w:rPr>
+                <w:rFonts w:cs=""/>
+                <w:b/>
+                <w:kern w:val="0"/>
+                <w:sz w:val="17"/>
+                <w:szCs w:val="22"/>
+                <w:lang w:val="en-US" w:eastAsia="en-US" w:bidi="ar-SA"/>
+              </w:rPr>
+              <w:t>Cinco status: ABERTO (renomeia CRIADO), AGUARDANDO_APROVACAO, PROCESSANDO_REEMBOLSO (renomeia PROCESSAR_REEMBOLSO), CANCELADO e FINALIZADO. AGUARDANDO_PAGAMENTO foi removido: pagamento recusado mantém o pedido ABERTO.</w:t>
+            </w:r>
+          </w:p>
+        </w:tc>
+      </w:tr>
+      <w:tr>
+        <w:trPr/>
+        <w:tc>
+          <w:tcPr>
+            <w:tcW w:w="520" w:type="dxa"/>
+            <w:tcBorders/>
+            <w:vAlign w:val="center"/>
+          </w:tcPr>
+          <w:p>
+            <w:pPr>
+              <w:pStyle w:val="Normal"/>
+              <w:widowControl/>
+              <w:suppressAutoHyphens w:val="true"/>
+              <w:spacing w:lineRule="auto" w:line="240" w:before="0" w:after="0"/>
+              <w:jc w:val="left"/>
+              <w:rPr>
+                <w:rFonts w:cs=""/>
+                <w:kern w:val="0"/>
+                <w:szCs w:val="22"/>
+                <w:lang w:val="en-US" w:eastAsia="en-US" w:bidi="ar-SA"/>
+              </w:rPr>
+            </w:pPr>
+            <w:r>
+              <w:rPr>
+                <w:rFonts w:cs=""/>
+                <w:b/>
+                <w:kern w:val="0"/>
+                <w:sz w:val="17"/>
+                <w:szCs w:val="22"/>
+                <w:lang w:val="en-US" w:eastAsia="en-US" w:bidi="ar-SA"/>
+              </w:rPr>
+              <w:t>2</w:t>
+            </w:r>
+          </w:p>
+        </w:tc>
+        <w:tc>
+          <w:tcPr>
+            <w:tcW w:w="1400" w:type="dxa"/>
+            <w:tcBorders/>
+            <w:vAlign w:val="center"/>
+          </w:tcPr>
+          <w:p>
+            <w:pPr>
+              <w:pStyle w:val="Normal"/>
+              <w:widowControl/>
+              <w:suppressAutoHyphens w:val="true"/>
+              <w:spacing w:lineRule="auto" w:line="240" w:before="0" w:after="0"/>
+              <w:jc w:val="left"/>
+              <w:rPr>
+                <w:rFonts w:cs=""/>
+                <w:kern w:val="0"/>
+                <w:szCs w:val="22"/>
+                <w:lang w:val="en-US" w:eastAsia="en-US" w:bidi="ar-SA"/>
+              </w:rPr>
+            </w:pPr>
+            <w:r>
+              <w:rPr>
+                <w:rFonts w:cs=""/>
+                <w:b/>
+                <w:kern w:val="0"/>
+                <w:sz w:val="17"/>
+                <w:szCs w:val="22"/>
+                <w:lang w:val="en-US" w:eastAsia="en-US" w:bidi="ar-SA"/>
+              </w:rPr>
+              <w:t>7.5, 7.7, 12.4, 13</w:t>
+            </w:r>
+          </w:p>
+        </w:tc>
+        <w:tc>
+          <w:tcPr>
+            <w:tcW w:w="4000" w:type="dxa"/>
+            <w:tcBorders/>
+            <w:vAlign w:val="center"/>
+          </w:tcPr>
+          <w:p>
+            <w:pPr>
+              <w:pStyle w:val="Normal"/>
+              <w:widowControl/>
+              <w:suppressAutoHyphens w:val="true"/>
+              <w:spacing w:lineRule="auto" w:line="240" w:before="0" w:after="0"/>
+              <w:jc w:val="left"/>
+              <w:rPr>
+                <w:rFonts w:cs=""/>
+                <w:kern w:val="0"/>
+                <w:szCs w:val="22"/>
+                <w:lang w:val="en-US" w:eastAsia="en-US" w:bidi="ar-SA"/>
+              </w:rPr>
+            </w:pPr>
+            <w:r>
+              <w:rPr>
+                <w:rFonts w:cs=""/>
+                <w:b/>
+                <w:kern w:val="0"/>
+                <w:sz w:val="17"/>
+                <w:szCs w:val="22"/>
+                <w:lang w:val="en-US" w:eastAsia="en-US" w:bidi="ar-SA"/>
+              </w:rPr>
+              <w:t>StatusPagamento: PENDENTE, APROVADO, RECUSADO.</w:t>
+            </w:r>
+          </w:p>
+        </w:tc>
+        <w:tc>
+          <w:tcPr>
+            <w:tcW w:w="4006" w:type="dxa"/>
+            <w:tcBorders/>
+            <w:vAlign w:val="center"/>
+          </w:tcPr>
+          <w:p>
+            <w:pPr>
+              <w:pStyle w:val="Normal"/>
+              <w:widowControl/>
+              <w:suppressAutoHyphens w:val="true"/>
+              <w:spacing w:lineRule="auto" w:line="240" w:before="0" w:after="0"/>
+              <w:jc w:val="left"/>
+              <w:rPr>
+                <w:rFonts w:cs=""/>
+                <w:kern w:val="0"/>
+                <w:szCs w:val="22"/>
+                <w:lang w:val="en-US" w:eastAsia="en-US" w:bidi="ar-SA"/>
+              </w:rPr>
+            </w:pPr>
+            <w:r>
+              <w:rPr>
+                <w:rFonts w:cs=""/>
+                <w:b/>
+                <w:kern w:val="0"/>
+                <w:sz w:val="17"/>
+                <w:szCs w:val="22"/>
+                <w:lang w:val="en-US" w:eastAsia="en-US" w:bidi="ar-SA"/>
+              </w:rPr>
+              <w:t>Novo status DEVOLVIDO, aplicado ao pagamento e ao pedido quando o reembolso é aprovado.</w:t>
+            </w:r>
+          </w:p>
+        </w:tc>
+      </w:tr>
+      <w:tr>
+        <w:trPr/>
+        <w:tc>
+          <w:tcPr>
+            <w:tcW w:w="520" w:type="dxa"/>
+            <w:tcBorders/>
+            <w:vAlign w:val="center"/>
+          </w:tcPr>
+          <w:p>
+            <w:pPr>
+              <w:pStyle w:val="Normal"/>
+              <w:widowControl/>
+              <w:suppressAutoHyphens w:val="true"/>
+              <w:spacing w:lineRule="auto" w:line="240" w:before="0" w:after="0"/>
+              <w:jc w:val="left"/>
+              <w:rPr>
+                <w:rFonts w:cs=""/>
+                <w:kern w:val="0"/>
+                <w:szCs w:val="22"/>
+                <w:lang w:val="en-US" w:eastAsia="en-US" w:bidi="ar-SA"/>
+              </w:rPr>
+            </w:pPr>
+            <w:r>
+              <w:rPr>
+                <w:rFonts w:cs=""/>
+                <w:b/>
+                <w:kern w:val="0"/>
+                <w:sz w:val="17"/>
+                <w:szCs w:val="22"/>
+                <w:lang w:val="en-US" w:eastAsia="en-US" w:bidi="ar-SA"/>
+              </w:rPr>
+              <w:t>3</w:t>
+            </w:r>
+          </w:p>
+        </w:tc>
+        <w:tc>
+          <w:tcPr>
+            <w:tcW w:w="1400" w:type="dxa"/>
+            <w:tcBorders/>
+            <w:vAlign w:val="center"/>
+          </w:tcPr>
+          <w:p>
+            <w:pPr>
+              <w:pStyle w:val="Normal"/>
+              <w:widowControl/>
+              <w:suppressAutoHyphens w:val="true"/>
+              <w:spacing w:lineRule="auto" w:line="240" w:before="0" w:after="0"/>
+              <w:jc w:val="left"/>
+              <w:rPr>
+                <w:rFonts w:cs=""/>
+                <w:kern w:val="0"/>
+                <w:szCs w:val="22"/>
+                <w:lang w:val="en-US" w:eastAsia="en-US" w:bidi="ar-SA"/>
+              </w:rPr>
+            </w:pPr>
+            <w:r>
+              <w:rPr>
+                <w:rFonts w:cs=""/>
+                <w:b/>
+                <w:kern w:val="0"/>
+                <w:sz w:val="17"/>
+                <w:szCs w:val="22"/>
+                <w:lang w:val="en-US" w:eastAsia="en-US" w:bidi="ar-SA"/>
+              </w:rPr>
+              <w:t>8.3, 10.4, 12.7</w:t>
+            </w:r>
+          </w:p>
+        </w:tc>
+        <w:tc>
+          <w:tcPr>
+            <w:tcW w:w="4000" w:type="dxa"/>
+            <w:tcBorders/>
+            <w:vAlign w:val="center"/>
+          </w:tcPr>
+          <w:p>
+            <w:pPr>
+              <w:pStyle w:val="Normal"/>
+              <w:widowControl/>
+              <w:suppressAutoHyphens w:val="true"/>
+              <w:spacing w:lineRule="auto" w:line="240" w:before="0" w:after="0"/>
+              <w:jc w:val="left"/>
+              <w:rPr>
+                <w:rFonts w:cs=""/>
+                <w:kern w:val="0"/>
+                <w:szCs w:val="22"/>
+                <w:lang w:val="en-US" w:eastAsia="en-US" w:bidi="ar-SA"/>
+              </w:rPr>
+            </w:pPr>
+            <w:r>
+              <w:rPr>
+                <w:rFonts w:cs=""/>
+                <w:b/>
+                <w:kern w:val="0"/>
+                <w:sz w:val="17"/>
+                <w:szCs w:val="22"/>
+                <w:lang w:val="en-US" w:eastAsia="en-US" w:bidi="ar-SA"/>
+              </w:rPr>
+              <w:t>Pedido registrado não podia ser editado.</w:t>
+            </w:r>
+          </w:p>
+        </w:tc>
+        <w:tc>
+          <w:tcPr>
+            <w:tcW w:w="4006" w:type="dxa"/>
+            <w:tcBorders/>
+            <w:vAlign w:val="center"/>
+          </w:tcPr>
+          <w:p>
+            <w:pPr>
+              <w:pStyle w:val="Normal"/>
+              <w:widowControl/>
+              <w:suppressAutoHyphens w:val="true"/>
+              <w:spacing w:lineRule="auto" w:line="240" w:before="0" w:after="0"/>
+              <w:jc w:val="left"/>
+              <w:rPr>
+                <w:rFonts w:cs=""/>
+                <w:kern w:val="0"/>
+                <w:szCs w:val="22"/>
+                <w:lang w:val="en-US" w:eastAsia="en-US" w:bidi="ar-SA"/>
+              </w:rPr>
+            </w:pPr>
+            <w:r>
+              <w:rPr>
+                <w:rFonts w:cs=""/>
+                <w:b/>
+                <w:kern w:val="0"/>
+                <w:sz w:val="17"/>
+                <w:szCs w:val="22"/>
+                <w:lang w:val="en-US" w:eastAsia="en-US" w:bidi="ar-SA"/>
+              </w:rPr>
+              <w:t>Pedido ABERTO permite editar só os itens (Edit + Save); ClienteUUID mandatory:create / readonly:update; reserva incremental (ReservarEstoqueRegistro on { create; update; } + Activate com implementação adicional).</w:t>
+            </w:r>
+          </w:p>
+        </w:tc>
+      </w:tr>
+      <w:tr>
+        <w:trPr/>
+        <w:tc>
+          <w:tcPr>
+            <w:tcW w:w="520" w:type="dxa"/>
+            <w:tcBorders/>
+            <w:vAlign w:val="center"/>
+          </w:tcPr>
+          <w:p>
+            <w:pPr>
+              <w:pStyle w:val="Normal"/>
+              <w:widowControl/>
+              <w:suppressAutoHyphens w:val="true"/>
+              <w:spacing w:lineRule="auto" w:line="240" w:before="0" w:after="0"/>
+              <w:jc w:val="left"/>
+              <w:rPr>
+                <w:rFonts w:cs=""/>
+                <w:kern w:val="0"/>
+                <w:szCs w:val="22"/>
+                <w:lang w:val="en-US" w:eastAsia="en-US" w:bidi="ar-SA"/>
+              </w:rPr>
+            </w:pPr>
+            <w:r>
+              <w:rPr>
+                <w:rFonts w:cs=""/>
+                <w:b/>
+                <w:kern w:val="0"/>
+                <w:sz w:val="17"/>
+                <w:szCs w:val="22"/>
+                <w:lang w:val="en-US" w:eastAsia="en-US" w:bidi="ar-SA"/>
+              </w:rPr>
+              <w:t>4</w:t>
+            </w:r>
+          </w:p>
+        </w:tc>
+        <w:tc>
+          <w:tcPr>
+            <w:tcW w:w="1400" w:type="dxa"/>
+            <w:tcBorders/>
+            <w:vAlign w:val="center"/>
+          </w:tcPr>
+          <w:p>
+            <w:pPr>
+              <w:pStyle w:val="Normal"/>
+              <w:widowControl/>
+              <w:suppressAutoHyphens w:val="true"/>
+              <w:spacing w:lineRule="auto" w:line="240" w:before="0" w:after="0"/>
+              <w:jc w:val="left"/>
+              <w:rPr>
+                <w:rFonts w:cs=""/>
+                <w:kern w:val="0"/>
+                <w:szCs w:val="22"/>
+                <w:lang w:val="en-US" w:eastAsia="en-US" w:bidi="ar-SA"/>
+              </w:rPr>
+            </w:pPr>
+            <w:r>
+              <w:rPr>
+                <w:rFonts w:cs=""/>
+                <w:b/>
+                <w:kern w:val="0"/>
+                <w:sz w:val="17"/>
+                <w:szCs w:val="22"/>
+                <w:lang w:val="en-US" w:eastAsia="en-US" w:bidi="ar-SA"/>
+              </w:rPr>
+              <w:t>15.4, 7.5</w:t>
+            </w:r>
+          </w:p>
+        </w:tc>
+        <w:tc>
+          <w:tcPr>
+            <w:tcW w:w="4000" w:type="dxa"/>
+            <w:tcBorders/>
+            <w:vAlign w:val="center"/>
+          </w:tcPr>
+          <w:p>
+            <w:pPr>
+              <w:pStyle w:val="Normal"/>
+              <w:widowControl/>
+              <w:suppressAutoHyphens w:val="true"/>
+              <w:spacing w:lineRule="auto" w:line="240" w:before="0" w:after="0"/>
+              <w:jc w:val="left"/>
+              <w:rPr>
+                <w:rFonts w:cs=""/>
+                <w:kern w:val="0"/>
+                <w:szCs w:val="22"/>
+                <w:lang w:val="en-US" w:eastAsia="en-US" w:bidi="ar-SA"/>
+              </w:rPr>
+            </w:pPr>
+            <w:r>
+              <w:rPr>
+                <w:rFonts w:cs=""/>
+                <w:b/>
+                <w:kern w:val="0"/>
+                <w:sz w:val="17"/>
+                <w:szCs w:val="22"/>
+                <w:lang w:val="en-US" w:eastAsia="en-US" w:bidi="ar-SA"/>
+              </w:rPr>
+              <w:t>Object Page com seções estáticas (Dados administrativos, Histórico - cliente, Histórico - itens).</w:t>
+            </w:r>
+          </w:p>
+        </w:tc>
+        <w:tc>
+          <w:tcPr>
+            <w:tcW w:w="4006" w:type="dxa"/>
+            <w:tcBorders/>
+            <w:vAlign w:val="center"/>
+          </w:tcPr>
+          <w:p>
+            <w:pPr>
+              <w:pStyle w:val="Normal"/>
+              <w:widowControl/>
+              <w:suppressAutoHyphens w:val="true"/>
+              <w:spacing w:lineRule="auto" w:line="240" w:before="0" w:after="0"/>
+              <w:jc w:val="left"/>
+              <w:rPr>
+                <w:rFonts w:cs=""/>
+                <w:kern w:val="0"/>
+                <w:szCs w:val="22"/>
+                <w:lang w:val="en-US" w:eastAsia="en-US" w:bidi="ar-SA"/>
+              </w:rPr>
+            </w:pPr>
+            <w:r>
+              <w:rPr>
+                <w:rFonts w:cs=""/>
+                <w:b/>
+                <w:kern w:val="0"/>
+                <w:sz w:val="17"/>
+                <w:szCs w:val="22"/>
+                <w:lang w:val="en-US" w:eastAsia="en-US" w:bidi="ar-SA"/>
+              </w:rPr>
+              <w:t>Seções dinâmicas: Dados do Cliente, Dados do Pedido (com os campos administrativos), Itens, Pagamento, Finalização/Cancelamento; origem dos dados (snapshot ou tabelas principais) conforme o status; indicadores persistidos mantidos por AtualizarFlagsStatus e hidden: #(Campo).</w:t>
+            </w:r>
+          </w:p>
+        </w:tc>
+      </w:tr>
+      <w:tr>
+        <w:trPr/>
+        <w:tc>
+          <w:tcPr>
+            <w:tcW w:w="520" w:type="dxa"/>
+            <w:tcBorders/>
+            <w:vAlign w:val="center"/>
+          </w:tcPr>
+          <w:p>
+            <w:pPr>
+              <w:pStyle w:val="Normal"/>
+              <w:widowControl/>
+              <w:suppressAutoHyphens w:val="true"/>
+              <w:spacing w:lineRule="auto" w:line="240" w:before="0" w:after="0"/>
+              <w:jc w:val="left"/>
+              <w:rPr>
+                <w:rFonts w:cs=""/>
+                <w:kern w:val="0"/>
+                <w:szCs w:val="22"/>
+                <w:lang w:val="en-US" w:eastAsia="en-US" w:bidi="ar-SA"/>
+              </w:rPr>
+            </w:pPr>
+            <w:r>
+              <w:rPr>
+                <w:rFonts w:cs=""/>
+                <w:b/>
+                <w:kern w:val="0"/>
+                <w:sz w:val="17"/>
+                <w:szCs w:val="22"/>
+                <w:lang w:val="en-US" w:eastAsia="en-US" w:bidi="ar-SA"/>
+              </w:rPr>
+              <w:t>5</w:t>
+            </w:r>
+          </w:p>
+        </w:tc>
+        <w:tc>
+          <w:tcPr>
+            <w:tcW w:w="1400" w:type="dxa"/>
+            <w:tcBorders/>
+            <w:vAlign w:val="center"/>
+          </w:tcPr>
+          <w:p>
+            <w:pPr>
+              <w:pStyle w:val="Normal"/>
+              <w:widowControl/>
+              <w:suppressAutoHyphens w:val="true"/>
+              <w:spacing w:lineRule="auto" w:line="240" w:before="0" w:after="0"/>
+              <w:jc w:val="left"/>
+              <w:rPr>
+                <w:rFonts w:cs=""/>
+                <w:kern w:val="0"/>
+                <w:szCs w:val="22"/>
+                <w:lang w:val="en-US" w:eastAsia="en-US" w:bidi="ar-SA"/>
+              </w:rPr>
+            </w:pPr>
+            <w:r>
+              <w:rPr>
+                <w:rFonts w:cs=""/>
+                <w:b/>
+                <w:kern w:val="0"/>
+                <w:sz w:val="17"/>
+                <w:szCs w:val="22"/>
+                <w:lang w:val="en-US" w:eastAsia="en-US" w:bidi="ar-SA"/>
+              </w:rPr>
+              <w:t>5, 15.2, 16, 18</w:t>
+            </w:r>
+          </w:p>
+        </w:tc>
+        <w:tc>
+          <w:tcPr>
+            <w:tcW w:w="4000" w:type="dxa"/>
+            <w:tcBorders/>
+            <w:vAlign w:val="center"/>
+          </w:tcPr>
+          <w:p>
+            <w:pPr>
+              <w:pStyle w:val="Normal"/>
+              <w:widowControl/>
+              <w:suppressAutoHyphens w:val="true"/>
+              <w:spacing w:lineRule="auto" w:line="240" w:before="0" w:after="0"/>
+              <w:jc w:val="left"/>
+              <w:rPr>
+                <w:rFonts w:cs=""/>
+                <w:kern w:val="0"/>
+                <w:szCs w:val="22"/>
+                <w:lang w:val="en-US" w:eastAsia="en-US" w:bidi="ar-SA"/>
+              </w:rPr>
+            </w:pPr>
+            <w:r>
+              <w:rPr>
+                <w:rFonts w:cs=""/>
+                <w:b/>
+                <w:kern w:val="0"/>
+                <w:sz w:val="17"/>
+                <w:szCs w:val="22"/>
+                <w:lang w:val="en-US" w:eastAsia="en-US" w:bidi="ar-SA"/>
+              </w:rPr>
+              <w:t>Ações Simular Pagamento e Aprovar / finalizar.</w:t>
+            </w:r>
+          </w:p>
+        </w:tc>
+        <w:tc>
+          <w:tcPr>
+            <w:tcW w:w="4006" w:type="dxa"/>
+            <w:tcBorders/>
+            <w:vAlign w:val="center"/>
+          </w:tcPr>
+          <w:p>
+            <w:pPr>
+              <w:pStyle w:val="Normal"/>
+              <w:widowControl/>
+              <w:suppressAutoHyphens w:val="true"/>
+              <w:spacing w:lineRule="auto" w:line="240" w:before="0" w:after="0"/>
+              <w:jc w:val="left"/>
+              <w:rPr>
+                <w:rFonts w:cs=""/>
+                <w:kern w:val="0"/>
+                <w:szCs w:val="22"/>
+                <w:lang w:val="en-US" w:eastAsia="en-US" w:bidi="ar-SA"/>
+              </w:rPr>
+            </w:pPr>
+            <w:r>
+              <w:rPr>
+                <w:rFonts w:cs=""/>
+                <w:b/>
+                <w:kern w:val="0"/>
+                <w:sz w:val="17"/>
+                <w:szCs w:val="22"/>
+                <w:lang w:val="en-US" w:eastAsia="en-US" w:bidi="ar-SA"/>
+              </w:rPr>
+              <w:t>Rótulos Efetuar Pagamento e Aprovar pedido (nomes técnicos SimularPagamento e AprovarPedido mantidos).</w:t>
+            </w:r>
+          </w:p>
+        </w:tc>
+      </w:tr>
+      <w:tr>
+        <w:trPr/>
+        <w:tc>
+          <w:tcPr>
+            <w:tcW w:w="520" w:type="dxa"/>
+            <w:tcBorders/>
+            <w:vAlign w:val="center"/>
+          </w:tcPr>
+          <w:p>
+            <w:pPr>
+              <w:pStyle w:val="Normal"/>
+              <w:widowControl/>
+              <w:suppressAutoHyphens w:val="true"/>
+              <w:spacing w:lineRule="auto" w:line="240" w:before="0" w:after="0"/>
+              <w:jc w:val="left"/>
+              <w:rPr>
+                <w:rFonts w:cs=""/>
+                <w:kern w:val="0"/>
+                <w:szCs w:val="22"/>
+                <w:lang w:val="en-US" w:eastAsia="en-US" w:bidi="ar-SA"/>
+              </w:rPr>
+            </w:pPr>
+            <w:r>
+              <w:rPr>
+                <w:rFonts w:cs=""/>
+                <w:b/>
+                <w:kern w:val="0"/>
+                <w:sz w:val="17"/>
+                <w:szCs w:val="22"/>
+                <w:lang w:val="en-US" w:eastAsia="en-US" w:bidi="ar-SA"/>
+              </w:rPr>
+              <w:t>6</w:t>
+            </w:r>
+          </w:p>
+        </w:tc>
+        <w:tc>
+          <w:tcPr>
+            <w:tcW w:w="1400" w:type="dxa"/>
+            <w:tcBorders/>
+            <w:vAlign w:val="center"/>
+          </w:tcPr>
+          <w:p>
+            <w:pPr>
+              <w:pStyle w:val="Normal"/>
+              <w:widowControl/>
+              <w:suppressAutoHyphens w:val="true"/>
+              <w:spacing w:lineRule="auto" w:line="240" w:before="0" w:after="0"/>
+              <w:jc w:val="left"/>
+              <w:rPr>
+                <w:rFonts w:cs=""/>
+                <w:kern w:val="0"/>
+                <w:szCs w:val="22"/>
+                <w:lang w:val="en-US" w:eastAsia="en-US" w:bidi="ar-SA"/>
+              </w:rPr>
+            </w:pPr>
+            <w:r>
+              <w:rPr>
+                <w:rFonts w:cs=""/>
+                <w:b/>
+                <w:kern w:val="0"/>
+                <w:sz w:val="17"/>
+                <w:szCs w:val="22"/>
+                <w:lang w:val="en-US" w:eastAsia="en-US" w:bidi="ar-SA"/>
+              </w:rPr>
+              <w:t>7.3, 8.1, 10.2, 16</w:t>
+            </w:r>
+          </w:p>
+        </w:tc>
+        <w:tc>
+          <w:tcPr>
+            <w:tcW w:w="4000" w:type="dxa"/>
+            <w:tcBorders/>
+            <w:vAlign w:val="center"/>
+          </w:tcPr>
+          <w:p>
+            <w:pPr>
+              <w:pStyle w:val="Normal"/>
+              <w:widowControl/>
+              <w:suppressAutoHyphens w:val="true"/>
+              <w:spacing w:lineRule="auto" w:line="240" w:before="0" w:after="0"/>
+              <w:jc w:val="left"/>
+              <w:rPr>
+                <w:rFonts w:cs=""/>
+                <w:kern w:val="0"/>
+                <w:szCs w:val="22"/>
+                <w:lang w:val="en-US" w:eastAsia="en-US" w:bidi="ar-SA"/>
+              </w:rPr>
+            </w:pPr>
+            <w:r>
+              <w:rPr>
+                <w:rFonts w:cs=""/>
+                <w:b/>
+                <w:kern w:val="0"/>
+                <w:sz w:val="17"/>
+                <w:szCs w:val="22"/>
+                <w:lang w:val="en-US" w:eastAsia="en-US" w:bidi="ar-SA"/>
+              </w:rPr>
+              <w:t>CEP editável em endereço gravado; a alteração gerava RAISE_SHORTDUMP (UPDATE com sy-subrc 4 em ZTA_PC_ENDERECO, pois o CEP é chave da tabela mas não da entidade).</w:t>
+            </w:r>
+          </w:p>
+        </w:tc>
+        <w:tc>
+          <w:tcPr>
+            <w:tcW w:w="4006" w:type="dxa"/>
+            <w:tcBorders/>
+            <w:vAlign w:val="center"/>
+          </w:tcPr>
+          <w:p>
+            <w:pPr>
+              <w:pStyle w:val="Normal"/>
+              <w:widowControl/>
+              <w:suppressAutoHyphens w:val="true"/>
+              <w:spacing w:lineRule="auto" w:line="240" w:before="0" w:after="0"/>
+              <w:jc w:val="left"/>
+              <w:rPr>
+                <w:rFonts w:cs=""/>
+                <w:kern w:val="0"/>
+                <w:szCs w:val="22"/>
+                <w:lang w:val="en-US" w:eastAsia="en-US" w:bidi="ar-SA"/>
+              </w:rPr>
+            </w:pPr>
+            <w:r>
+              <w:rPr>
+                <w:rFonts w:cs=""/>
+                <w:b/>
+                <w:kern w:val="0"/>
+                <w:sz w:val="17"/>
+                <w:szCs w:val="22"/>
+                <w:lang w:val="en-US" w:eastAsia="en-US" w:bidi="ar-SA"/>
+              </w:rPr>
+              <w:t>CEP somente leitura depois que o endereço é gravado (field ( features : instance ) Cep). Para trocar, excluir o endereço e cadastrar outro.</w:t>
+            </w:r>
+          </w:p>
+        </w:tc>
+      </w:tr>
+      <w:tr>
+        <w:trPr/>
+        <w:tc>
+          <w:tcPr>
+            <w:tcW w:w="520" w:type="dxa"/>
+            <w:tcBorders/>
+            <w:vAlign w:val="center"/>
+          </w:tcPr>
+          <w:p>
+            <w:pPr>
+              <w:pStyle w:val="Normal"/>
+              <w:widowControl/>
+              <w:suppressAutoHyphens w:val="true"/>
+              <w:spacing w:lineRule="auto" w:line="240" w:before="0" w:after="0"/>
+              <w:jc w:val="left"/>
+              <w:rPr>
+                <w:rFonts w:cs=""/>
+                <w:kern w:val="0"/>
+                <w:szCs w:val="22"/>
+                <w:lang w:val="en-US" w:eastAsia="en-US" w:bidi="ar-SA"/>
+              </w:rPr>
+            </w:pPr>
+            <w:r>
+              <w:rPr>
+                <w:rFonts w:cs=""/>
+                <w:b/>
+                <w:kern w:val="0"/>
+                <w:sz w:val="17"/>
+                <w:szCs w:val="22"/>
+                <w:lang w:val="en-US" w:eastAsia="en-US" w:bidi="ar-SA"/>
+              </w:rPr>
+              <w:t>7</w:t>
+            </w:r>
+          </w:p>
+        </w:tc>
+        <w:tc>
+          <w:tcPr>
+            <w:tcW w:w="1400" w:type="dxa"/>
+            <w:tcBorders/>
+            <w:vAlign w:val="center"/>
+          </w:tcPr>
+          <w:p>
+            <w:pPr>
+              <w:pStyle w:val="Normal"/>
+              <w:widowControl/>
+              <w:suppressAutoHyphens w:val="true"/>
+              <w:spacing w:lineRule="auto" w:line="240" w:before="0" w:after="0"/>
+              <w:jc w:val="left"/>
+              <w:rPr>
+                <w:rFonts w:cs=""/>
+                <w:kern w:val="0"/>
+                <w:szCs w:val="22"/>
+                <w:lang w:val="en-US" w:eastAsia="en-US" w:bidi="ar-SA"/>
+              </w:rPr>
+            </w:pPr>
+            <w:r>
+              <w:rPr>
+                <w:rFonts w:cs=""/>
+                <w:b/>
+                <w:kern w:val="0"/>
+                <w:sz w:val="17"/>
+                <w:szCs w:val="22"/>
+                <w:lang w:val="en-US" w:eastAsia="en-US" w:bidi="ar-SA"/>
+              </w:rPr>
+              <w:t>20</w:t>
+            </w:r>
+          </w:p>
+        </w:tc>
+        <w:tc>
+          <w:tcPr>
+            <w:tcW w:w="4000" w:type="dxa"/>
+            <w:tcBorders/>
+            <w:vAlign w:val="center"/>
+          </w:tcPr>
+          <w:p>
+            <w:pPr>
+              <w:pStyle w:val="Normal"/>
+              <w:widowControl/>
+              <w:suppressAutoHyphens w:val="true"/>
+              <w:spacing w:lineRule="auto" w:line="240" w:before="0" w:after="0"/>
+              <w:jc w:val="left"/>
+              <w:rPr>
+                <w:rFonts w:cs=""/>
+                <w:kern w:val="0"/>
+                <w:szCs w:val="22"/>
+                <w:lang w:val="en-US" w:eastAsia="en-US" w:bidi="ar-SA"/>
+              </w:rPr>
+            </w:pPr>
+            <w:r>
+              <w:rPr>
+                <w:rFonts w:cs=""/>
+                <w:b/>
+                <w:kern w:val="0"/>
+                <w:sz w:val="17"/>
+                <w:szCs w:val="22"/>
+                <w:lang w:val="en-US" w:eastAsia="en-US" w:bidi="ar-SA"/>
+              </w:rPr>
+              <w:t>Pedidos existentes no modelo antigo de status.</w:t>
+            </w:r>
+          </w:p>
+        </w:tc>
+        <w:tc>
+          <w:tcPr>
+            <w:tcW w:w="4006" w:type="dxa"/>
+            <w:tcBorders/>
+            <w:vAlign w:val="center"/>
+          </w:tcPr>
+          <w:p>
+            <w:pPr>
+              <w:pStyle w:val="Normal"/>
+              <w:widowControl/>
+              <w:suppressAutoHyphens w:val="true"/>
+              <w:spacing w:lineRule="auto" w:line="240" w:before="0" w:after="0"/>
+              <w:jc w:val="left"/>
+              <w:rPr>
+                <w:rFonts w:cs=""/>
+                <w:kern w:val="0"/>
+                <w:szCs w:val="22"/>
+                <w:lang w:val="en-US" w:eastAsia="en-US" w:bidi="ar-SA"/>
+              </w:rPr>
+            </w:pPr>
+            <w:r>
+              <w:rPr>
+                <w:rFonts w:cs=""/>
+                <w:b/>
+                <w:kern w:val="0"/>
+                <w:sz w:val="17"/>
+                <w:szCs w:val="22"/>
+                <w:lang w:val="en-US" w:eastAsia="en-US" w:bidi="ar-SA"/>
+              </w:rPr>
+              <w:t>ZCL_PC_SETUP migra CRIADO/AGUARDANDO_PAGAMENTO para ABERTO e PROCESSAR_REEMBOLSO para PROCESSANDO_REEMBOLSO, e recalcula os indicadores.</w:t>
+            </w:r>
+          </w:p>
+        </w:tc>
+      </w:tr>
+      <w:tr>
+        <w:trPr/>
+        <w:tc>
+          <w:tcPr>
+            <w:tcW w:w="520" w:type="dxa"/>
+            <w:tcBorders/>
+            <w:vAlign w:val="center"/>
+          </w:tcPr>
+          <w:p>
+            <w:pPr>
+              <w:pStyle w:val="Normal"/>
+              <w:widowControl/>
+              <w:suppressAutoHyphens w:val="true"/>
+              <w:spacing w:lineRule="auto" w:line="240" w:before="0" w:after="0"/>
+              <w:jc w:val="left"/>
+              <w:rPr>
+                <w:rFonts w:cs=""/>
+                <w:kern w:val="0"/>
+                <w:szCs w:val="22"/>
+                <w:lang w:val="en-US" w:eastAsia="en-US" w:bidi="ar-SA"/>
+              </w:rPr>
+            </w:pPr>
+            <w:r>
+              <w:rPr>
+                <w:rFonts w:cs=""/>
+                <w:b/>
+                <w:kern w:val="0"/>
+                <w:sz w:val="17"/>
+                <w:szCs w:val="22"/>
+                <w:lang w:val="en-US" w:eastAsia="en-US" w:bidi="ar-SA"/>
+              </w:rPr>
+              <w:t>8</w:t>
+            </w:r>
+          </w:p>
+        </w:tc>
+        <w:tc>
+          <w:tcPr>
+            <w:tcW w:w="1400" w:type="dxa"/>
+            <w:tcBorders/>
+            <w:vAlign w:val="center"/>
+          </w:tcPr>
+          <w:p>
+            <w:pPr>
+              <w:pStyle w:val="Normal"/>
+              <w:widowControl/>
+              <w:suppressAutoHyphens w:val="true"/>
+              <w:spacing w:lineRule="auto" w:line="240" w:before="0" w:after="0"/>
+              <w:jc w:val="left"/>
+              <w:rPr>
+                <w:rFonts w:cs=""/>
+                <w:kern w:val="0"/>
+                <w:szCs w:val="22"/>
+                <w:lang w:val="en-US" w:eastAsia="en-US" w:bidi="ar-SA"/>
+              </w:rPr>
+            </w:pPr>
+            <w:r>
+              <w:rPr>
+                <w:rFonts w:cs=""/>
+                <w:b/>
+                <w:kern w:val="0"/>
+                <w:sz w:val="17"/>
+                <w:szCs w:val="22"/>
+                <w:lang w:val="en-US" w:eastAsia="en-US" w:bidi="ar-SA"/>
+              </w:rPr>
+              <w:t>2.1, 20, 24</w:t>
+            </w:r>
+          </w:p>
+        </w:tc>
+        <w:tc>
+          <w:tcPr>
+            <w:tcW w:w="4000" w:type="dxa"/>
+            <w:tcBorders/>
+            <w:vAlign w:val="center"/>
+          </w:tcPr>
+          <w:p>
+            <w:pPr>
+              <w:pStyle w:val="Normal"/>
+              <w:widowControl/>
+              <w:suppressAutoHyphens w:val="true"/>
+              <w:spacing w:lineRule="auto" w:line="240" w:before="0" w:after="0"/>
+              <w:jc w:val="left"/>
+              <w:rPr>
+                <w:rFonts w:cs=""/>
+                <w:kern w:val="0"/>
+                <w:szCs w:val="22"/>
+                <w:lang w:val="en-US" w:eastAsia="en-US" w:bidi="ar-SA"/>
+              </w:rPr>
+            </w:pPr>
+            <w:r>
+              <w:rPr>
+                <w:rFonts w:cs=""/>
+                <w:b/>
+                <w:kern w:val="0"/>
+                <w:sz w:val="17"/>
+                <w:szCs w:val="22"/>
+                <w:lang w:val="en-US" w:eastAsia="en-US" w:bidi="ar-SA"/>
+              </w:rPr>
+              <w:t>Sem camada analítica.</w:t>
+            </w:r>
+          </w:p>
+        </w:tc>
+        <w:tc>
+          <w:tcPr>
+            <w:tcW w:w="4006" w:type="dxa"/>
+            <w:tcBorders/>
+            <w:vAlign w:val="center"/>
+          </w:tcPr>
+          <w:p>
+            <w:pPr>
+              <w:pStyle w:val="Normal"/>
+              <w:widowControl/>
+              <w:suppressAutoHyphens w:val="true"/>
+              <w:spacing w:lineRule="auto" w:line="240" w:before="0" w:after="0"/>
+              <w:jc w:val="left"/>
+              <w:rPr>
+                <w:rFonts w:cs=""/>
+                <w:kern w:val="0"/>
+                <w:szCs w:val="22"/>
+                <w:lang w:val="en-US" w:eastAsia="en-US" w:bidi="ar-SA"/>
+              </w:rPr>
+            </w:pPr>
+            <w:r>
+              <w:rPr>
+                <w:rFonts w:cs=""/>
+                <w:b/>
+                <w:kern w:val="0"/>
+                <w:sz w:val="17"/>
+                <w:szCs w:val="22"/>
+                <w:lang w:val="en-US" w:eastAsia="en-US" w:bidi="ar-SA"/>
+              </w:rPr>
+              <w:t>Cubos ZI_PC_*_CUBE, consultas ZC_PC_*_ANALISE, serviço ZUI_PC_ANALITICO, 20 ALPs e o Painel de Compras (OVP).</w:t>
+            </w:r>
+          </w:p>
+        </w:tc>
+      </w:tr>
+      <w:tr>
+        <w:trPr/>
+        <w:tc>
+          <w:tcPr>
+            <w:tcW w:w="520" w:type="dxa"/>
+            <w:tcBorders/>
+            <w:vAlign w:val="center"/>
+          </w:tcPr>
+          <w:p>
+            <w:pPr>
+              <w:pStyle w:val="Normal"/>
+              <w:widowControl/>
+              <w:suppressAutoHyphens w:val="true"/>
+              <w:spacing w:lineRule="auto" w:line="240" w:before="0" w:after="0"/>
+              <w:jc w:val="left"/>
+              <w:rPr>
+                <w:rFonts w:cs=""/>
+                <w:kern w:val="0"/>
+                <w:szCs w:val="22"/>
+                <w:lang w:val="en-US" w:eastAsia="en-US" w:bidi="ar-SA"/>
+              </w:rPr>
+            </w:pPr>
+            <w:r>
+              <w:rPr>
+                <w:rFonts w:cs=""/>
+                <w:b/>
+                <w:kern w:val="0"/>
+                <w:sz w:val="17"/>
+                <w:szCs w:val="22"/>
+                <w:lang w:val="en-US" w:eastAsia="en-US" w:bidi="ar-SA"/>
+              </w:rPr>
+              <w:t>9</w:t>
+            </w:r>
+          </w:p>
+        </w:tc>
+        <w:tc>
+          <w:tcPr>
+            <w:tcW w:w="1400" w:type="dxa"/>
+            <w:tcBorders/>
+            <w:vAlign w:val="center"/>
+          </w:tcPr>
+          <w:p>
+            <w:pPr>
+              <w:pStyle w:val="Normal"/>
+              <w:widowControl/>
+              <w:suppressAutoHyphens w:val="true"/>
+              <w:spacing w:lineRule="auto" w:line="240" w:before="0" w:after="0"/>
+              <w:jc w:val="left"/>
+              <w:rPr>
+                <w:rFonts w:cs=""/>
+                <w:kern w:val="0"/>
+                <w:szCs w:val="22"/>
+                <w:lang w:val="en-US" w:eastAsia="en-US" w:bidi="ar-SA"/>
+              </w:rPr>
+            </w:pPr>
+            <w:r>
+              <w:rPr>
+                <w:rFonts w:cs=""/>
+                <w:b/>
+                <w:kern w:val="0"/>
+                <w:sz w:val="17"/>
+                <w:szCs w:val="22"/>
+                <w:lang w:val="en-US" w:eastAsia="en-US" w:bidi="ar-SA"/>
+              </w:rPr>
+              <w:t>2.2, 25</w:t>
+            </w:r>
+          </w:p>
+        </w:tc>
+        <w:tc>
+          <w:tcPr>
+            <w:tcW w:w="4000" w:type="dxa"/>
+            <w:tcBorders/>
+            <w:vAlign w:val="center"/>
+          </w:tcPr>
+          <w:p>
+            <w:pPr>
+              <w:pStyle w:val="Normal"/>
+              <w:widowControl/>
+              <w:suppressAutoHyphens w:val="true"/>
+              <w:spacing w:lineRule="auto" w:line="240" w:before="0" w:after="0"/>
+              <w:jc w:val="left"/>
+              <w:rPr>
+                <w:rFonts w:cs=""/>
+                <w:kern w:val="0"/>
+                <w:szCs w:val="22"/>
+                <w:lang w:val="en-US" w:eastAsia="en-US" w:bidi="ar-SA"/>
+              </w:rPr>
+            </w:pPr>
+            <w:r>
+              <w:rPr>
+                <w:rFonts w:cs=""/>
+                <w:b/>
+                <w:kern w:val="0"/>
+                <w:sz w:val="17"/>
+                <w:szCs w:val="22"/>
+                <w:lang w:val="en-US" w:eastAsia="en-US" w:bidi="ar-SA"/>
+              </w:rPr>
+              <w:t>Testes automatizados fora do escopo; classes de teste temporárias.</w:t>
+            </w:r>
+          </w:p>
+        </w:tc>
+        <w:tc>
+          <w:tcPr>
+            <w:tcW w:w="4006" w:type="dxa"/>
+            <w:tcBorders/>
+            <w:vAlign w:val="center"/>
+          </w:tcPr>
+          <w:p>
+            <w:pPr>
+              <w:pStyle w:val="Normal"/>
+              <w:widowControl/>
+              <w:suppressAutoHyphens w:val="true"/>
+              <w:spacing w:lineRule="auto" w:line="240" w:before="0" w:after="0"/>
+              <w:jc w:val="left"/>
+              <w:rPr>
+                <w:rFonts w:cs=""/>
+                <w:kern w:val="0"/>
+                <w:szCs w:val="22"/>
+                <w:lang w:val="en-US" w:eastAsia="en-US" w:bidi="ar-SA"/>
+              </w:rPr>
+            </w:pPr>
+            <w:r>
+              <w:rPr>
+                <w:rFonts w:cs=""/>
+                <w:b/>
+                <w:kern w:val="0"/>
+                <w:sz w:val="17"/>
+                <w:szCs w:val="22"/>
+                <w:lang w:val="en-US" w:eastAsia="en-US" w:bidi="ar-SA"/>
+              </w:rPr>
+              <w:t>Suíte ABAP Unit permanente (50 testes em ZCL_PC_UTIL), mantida no SAP e no repositório e ajustada junto com as funcionalidades.</w:t>
+            </w:r>
+          </w:p>
+        </w:tc>
+      </w:tr>
+    </w:tbl>
+    <w:p>
+      <w:pPr>
+        <w:pStyle w:val="Heading1"/>
+        <w:rPr/>
+      </w:pPr>
+      <w:r>
+        <w:rPr/>
+        <w:t>24. Camada Analítica (ALP e Overview Page)</w:t>
+      </w:r>
+    </w:p>
+    <w:p>
+      <w:pPr>
+        <w:pStyle w:val="Normal"/>
+        <w:rPr/>
+      </w:pPr>
+      <w:r>
+        <w:rPr/>
+        <w:t>A camada analítica é somente leitura e independente dos aplicativos de gestão. Cada domínio tem um cubo de análise (ZI_PC_*_CUBE) e uma consulta (ZC_PC_*_ANALISE) com @Aggregation.default nas medidas e @OData.applySupportedForAggregation: #FULL, o que permite ao servidor aceitar $apply=groupby/aggregate. Gráficos e filtros vêm das metadata extensions ZC_PC_*_ANALISE: cada cenário é um UI.Chart mais uma UI.PresentationVariant com qualifier.</w:t>
+      </w:r>
+    </w:p>
+    <w:p>
+      <w:pPr>
+        <w:pStyle w:val="ListBullet"/>
+        <w:numPr>
+          <w:ilvl w:val="0"/>
+          <w:numId w:val="1"/>
+        </w:numPr>
+        <w:rPr/>
+      </w:pPr>
+      <w:r>
+        <w:rPr/>
+        <w:t>Serviço: ZUI_PC_ANALITICO (Service Binding ZUI_PC_ANALITICO_O4, OData V4 UI), no pacote ZAVBS_PC_COMMON.</w:t>
+      </w:r>
+    </w:p>
+    <w:p>
+      <w:pPr>
+        <w:pStyle w:val="ListBullet"/>
+        <w:numPr>
+          <w:ilvl w:val="0"/>
+          <w:numId w:val="1"/>
+        </w:numPr>
+        <w:rPr/>
+      </w:pPr>
+      <w:r>
+        <w:rPr/>
+        <w:t>Pedidos: ZI_PC_PEDIDO_CUBE → ZC_PC_PEDIDO_ANALISE. Clientes: ZI_PC_CLIENTE_CUBE → ZC_PC_CLIENTE_ANALISE. Estoque: ZI_PC_ITEM_CUBE → ZC_PC_ITEM_ANALISE. Reembolsos: ZI_PC_REEMB_CUBE → ZC_PC_REEMB_ANALISE.</w:t>
+      </w:r>
+    </w:p>
+    <w:p>
+      <w:pPr>
+        <w:pStyle w:val="ListBullet"/>
+        <w:numPr>
+          <w:ilvl w:val="0"/>
+          <w:numId w:val="1"/>
+        </w:numPr>
+        <w:rPr/>
+      </w:pPr>
+      <w:r>
+        <w:rPr/>
+        <w:t>20 aplicações ALP (ui5/analise-*): um List Report V4 por cenário com apenas o gráfico (sem tabela e sem Object Page); filtros por UI.SelectionFields. São 5 cenários de pedidos, 5 de clientes, 5 de estoque e 5 de reembolsos.</w:t>
+      </w:r>
+    </w:p>
+    <w:p>
+      <w:pPr>
+        <w:pStyle w:val="ListBullet"/>
+        <w:numPr>
+          <w:ilvl w:val="0"/>
+          <w:numId w:val="1"/>
+        </w:numPr>
+        <w:rPr/>
+      </w:pPr>
+      <w:r>
+        <w:rPr/>
+        <w:t>Painel de Compras (ui5/painel-compras, OData V4, cards sap.ovp.cards.v4.*): 20 cards de gráfico, 3 listas de ação (pedidos aguardando aprovação, reembolsos pendentes e estoque crítico) e um card de atalhos para os quatro aplicativos de gestão.</w:t>
+      </w:r>
+    </w:p>
+    <w:p>
+      <w:pPr>
+        <w:pStyle w:val="ListBullet"/>
+        <w:numPr>
+          <w:ilvl w:val="0"/>
+          <w:numId w:val="1"/>
+        </w:numPr>
+        <w:rPr/>
+      </w:pPr>
+      <w:r>
+        <w:rPr/>
+        <w:t>Os gráficos dependem de agregação no servidor; para ter dados é preciso carregar os dados de demonstração (ZCL_PC_SETUP). A implantação e a verificação em execução no launchpad do sistema ainda estão pendentes.</w:t>
+      </w:r>
+    </w:p>
+    <w:p>
+      <w:pPr>
+        <w:pStyle w:val="Heading1"/>
+        <w:rPr/>
+      </w:pPr>
+      <w:r>
+        <w:rPr/>
+        <w:t>25. Testes Automatizados</w:t>
+      </w:r>
+    </w:p>
+    <w:p>
+      <w:pPr>
+        <w:pStyle w:val="Normal"/>
+        <w:rPr/>
+      </w:pPr>
+      <w:r>
+        <w:rPr/>
+        <w:t>As classes de teste ABAP Unit são permanentes: ficam no sistema SAP e no repositório e são ajustadas sempre que a funcionalidade que cobrem muda. Os testes de integração semeiam os próprios dados por INSERT (o ABAP Unit desfaz a gravação) e executam no máximo um Edit por teste, pois um rascunho sobrevive ao Activate dentro da mesma LUW. A classe ZCL_PC_UTIL tem 50 testes, todos passando.</w:t>
+      </w:r>
+    </w:p>
+    <w:p>
+      <w:pPr>
+        <w:pStyle w:val="ListBullet"/>
+        <w:numPr>
+          <w:ilvl w:val="0"/>
+          <w:numId w:val="1"/>
+        </w:numPr>
+        <w:rPr/>
+      </w:pPr>
+      <w:r>
+        <w:rPr/>
+        <w:t>ltcl_digitos_cpf, ltcl_email_imagem e ltcl_estoque_endereco: CPF, telefone, e-mail, imagens (JPEG/PNG/WEBP), status de estoque e endereço formatado.</w:t>
+      </w:r>
+    </w:p>
+    <w:p>
+      <w:pPr>
+        <w:pStyle w:val="ListBullet"/>
+        <w:numPr>
+          <w:ilvl w:val="0"/>
+          <w:numId w:val="1"/>
+        </w:numPr>
+        <w:rPr/>
+      </w:pPr>
+      <w:r>
+        <w:rPr/>
+        <w:t>ltcl_edicao_pedido: alterar, incluir e remover item com reserva incremental; apenas pedido ABERTO é editável.</w:t>
+      </w:r>
+    </w:p>
+    <w:p>
+      <w:pPr>
+        <w:pStyle w:val="ListBullet"/>
+        <w:numPr>
+          <w:ilvl w:val="0"/>
+          <w:numId w:val="1"/>
+        </w:numPr>
+        <w:rPr/>
+      </w:pPr>
+      <w:r>
+        <w:rPr/>
+        <w:t>ltcl_registro_pedido: o Save cria o pedido ABERTO, o número e a reserva; nunca se reserva acima do estoque.</w:t>
+      </w:r>
+    </w:p>
+    <w:p>
+      <w:pPr>
+        <w:pStyle w:val="ListBullet"/>
+        <w:numPr>
+          <w:ilvl w:val="0"/>
+          <w:numId w:val="1"/>
+        </w:numPr>
+        <w:rPr/>
+      </w:pPr>
+      <w:r>
+        <w:rPr/>
+        <w:t>ltcl_ciclo_pedido: pagamento aprovado e recusado, aprovação com baixa de estoque, cancelamento com e sem pagamento aprovado (reembolso).</w:t>
+      </w:r>
+    </w:p>
+    <w:p>
+      <w:pPr>
+        <w:pStyle w:val="ListBullet"/>
+        <w:numPr>
+          <w:ilvl w:val="0"/>
+          <w:numId w:val="1"/>
+        </w:numPr>
+        <w:rPr/>
+      </w:pPr>
+      <w:r>
+        <w:rPr/>
+        <w:t>ltcl_reembolso: aprovar cancela o pedido, devolve o pagamento e libera a reserva; rejeitar exige motivo e retoma o pedido.</w:t>
+      </w:r>
+    </w:p>
+    <w:p>
+      <w:pPr>
+        <w:pStyle w:val="ListBullet"/>
+        <w:numPr>
+          <w:ilvl w:val="0"/>
+          <w:numId w:val="1"/>
+        </w:numPr>
+        <w:rPr/>
+      </w:pPr>
+      <w:r>
+        <w:rPr/>
+        <w:t>ltcl_sku_item: SKU com prefixo da categoria e sequencial único (exige o objeto de numeração ZPC_NR configurado).</w:t>
+      </w:r>
+    </w:p>
+    <w:p>
+      <w:pPr>
+        <w:pStyle w:val="ListBullet"/>
+        <w:numPr>
+          <w:ilvl w:val="0"/>
+          <w:numId w:val="1"/>
+        </w:numPr>
+        <w:rPr/>
+      </w:pPr>
+      <w:r>
+        <w:rPr/>
+        <w:t>ltcl_persistencia_endereco: save real (COMMIT ENTITIES) com test doubles (cl_cds_test_environment para as entidades ZR_* e cl_osql_test_environment para as tabelas de rascunho); cobre endereço novo direto e por rascunho e o CEP somente leitura.</w:t>
+      </w:r>
+    </w:p>
+    <w:p>
+      <w:pPr>
+        <w:pStyle w:val="ListBullet"/>
+        <w:numPr>
+          <w:ilvl w:val="0"/>
+          <w:numId w:val="1"/>
+        </w:numPr>
+        <w:rPr/>
+      </w:pPr>
+      <w:r>
+        <w:rPr/>
+        <w:t>Também permanentes: ZCL_PC_PAGAMENTO_SIM (14 testes), ZCL_PC_IMPORTACAO (17) e ZCL_PC_PLANILHA (17).</w:t>
+      </w:r>
+    </w:p>
+    <w:p>
+      <w:pPr>
+        <w:pStyle w:val="ListBullet"/>
+        <w:numPr>
+          <w:ilvl w:val="0"/>
+          <w:numId w:val="1"/>
+        </w:numPr>
+        <w:rPr/>
+      </w:pPr>
+      <w:r>
+        <w:rPr/>
+        <w:t>Depois de editar um include de testes, ativar também o include testclasses; senão o ABAP Unit executa a versão antiga.</w:t>
+      </w:r>
+    </w:p>
     <w:sectPr>
       <w:headerReference w:type="even" r:id="rId2"/>
       <w:headerReference w:type="default" r:id="rId3"/>
@@ -40815,7 +43609,7 @@
         <w:sz w:val="24"/>
         <w:lang w:val="pt-BR"/>
       </w:rPr>
-      <w:t>+ Fiori (v2.1)</w:t>
+      <w:t>+ Fiori (v2.2)</w:t>
     </w:r>
   </w:p>
 </w:hdr>

</xml_diff>